<commit_message>
Add beginner-friendly Codex model selection
</commit_message>
<xml_diff>
--- a/docs/Codex_App_かんたん切り替え_仕様書.docx
+++ b/docs/Codex_App_かんたん切り替え_仕様書.docx
@@ -2,7 +2,7 @@
 <file path=word/document.xml><?xml version="1.0" encoding="utf-8"?>
 <w:document xmlns:w="http://schemas.openxmlformats.org/wordprocessingml/2006/main" xmlns:m="http://schemas.openxmlformats.org/officeDocument/2006/math" xmlns:r="http://schemas.openxmlformats.org/officeDocument/2006/relationships" xmlns:o="urn:schemas-microsoft-com:office:office" xmlns:v="urn:schemas-microsoft-com:vml" xmlns:w10="urn:schemas-microsoft-com:office:word" xmlns:a="http://schemas.openxmlformats.org/drawingml/2006/main" xmlns:pic="http://schemas.openxmlformats.org/drawingml/2006/picture" xmlns:wp="http://schemas.openxmlformats.org/drawingml/2006/wordprocessingDrawing">
   <w:body>
-    <w:bookmarkStart w:id="29" w:name="codex-app-かんたん切り替え-仕様書"/>
+    <w:bookmarkStart w:id="28" w:name="codex-app-かんたん切り替え-仕様書"/>
     <w:p>
       <w:pPr>
         <w:jc w:val="center"/>
@@ -55,7 +55,7 @@
           <w:color w:val="5A6E78"/>
           <w:sz w:val="19"/>
         </w:rPr>
-        <w:t>バージョン 0.1.0  |  仕様書</w:t>
+        <w:t>バージョン 0.2.0  |  仕様書</w:t>
       </w:r>
     </w:p>
     <w:p>
@@ -291,7 +291,7 @@
                 <w:rFonts w:ascii="Yu Gothic" w:hAnsi="Yu Gothic" w:eastAsia="Yu Gothic"/>
                 <w:sz w:val="19"/>
               </w:rPr>
-              <w:t xml:space="preserve">0.1.0</w:t>
+              <w:t xml:space="preserve">0.2.0</w:t>
             </w:r>
           </w:p>
         </w:tc>
@@ -344,14 +344,14 @@
                 <w:rFonts w:ascii="Yu Gothic" w:hAnsi="Yu Gothic" w:eastAsia="Yu Gothic"/>
                 <w:sz w:val="19"/>
               </w:rPr>
-              <w:t xml:space="preserve">macOS </w:t>
+              <w:t xml:space="preserve">arm64 macOS </w:t>
             </w:r>
             <w:r>
               <w:rPr>
                 <w:rFonts w:hint="eastAsia" w:ascii="Yu Gothic" w:hAnsi="Yu Gothic" w:eastAsia="Yu Gothic"/>
                 <w:sz w:val="19"/>
               </w:rPr>
-              <w:t xml:space="preserve">12以降（初版）</w:t>
+              <w:t xml:space="preserve">12以降</w:t>
             </w:r>
           </w:p>
         </w:tc>
@@ -489,7 +489,7 @@
                 <w:rFonts w:hint="eastAsia" w:ascii="Yu Gothic" w:hAnsi="Yu Gothic" w:eastAsia="Yu Gothic"/>
                 <w:sz w:val="19"/>
               </w:rPr>
-              <w:t xml:space="preserve">既定のOllama接続モデル</w:t>
+              <w:t xml:space="preserve">初期・推奨Ollamaモデル</w:t>
             </w:r>
           </w:p>
         </w:tc>
@@ -560,7 +560,7 @@
         <w:rPr>
           <w:rFonts w:hint="eastAsia" w:ascii="Yu Gothic" w:hAnsi="Yu Gothic" w:eastAsia="Yu Gothic"/>
         </w:rPr>
-        <w:t xml:space="preserve">Appの接続先を切り替える。</w:t>
+        <w:t xml:space="preserve">Appの通常GPTとOllamaモデルを切り替える。</w:t>
       </w:r>
       <w:r>
         <w:rPr>
@@ -572,7 +572,31 @@
         <w:rPr>
           <w:rFonts w:hint="eastAsia" w:ascii="Yu Gothic" w:hAnsi="Yu Gothic" w:eastAsia="Yu Gothic"/>
         </w:rPr>
-        <w:t xml:space="preserve">また、将来作成するRAGアプリ、AIエージェント、自作AIアプリ向けに、</w:t>
+        <w:t xml:space="preserve">初心者向けの分かりやすさを維持しながら、Codex</w:t>
+      </w:r>
+      <w:r>
+        <w:rPr>
+          <w:rFonts w:ascii="Yu Gothic" w:hAnsi="Yu Gothic" w:eastAsia="Yu Gothic"/>
+        </w:rPr>
+        <w:t xml:space="preserve"> </w:t>
+      </w:r>
+      <w:r>
+        <w:rPr>
+          <w:rFonts w:hint="eastAsia" w:ascii="Yu Gothic" w:hAnsi="Yu Gothic" w:eastAsia="Yu Gothic"/>
+        </w:rPr>
+        <w:t xml:space="preserve">Appで使用するCloudモデル・ローカルモデルを</w:t>
+      </w:r>
+      <w:r>
+        <w:rPr>
+          <w:rFonts w:ascii="Yu Gothic" w:hAnsi="Yu Gothic" w:eastAsia="Yu Gothic"/>
+        </w:rPr>
+        <w:t xml:space="preserve"> </w:t>
+      </w:r>
+      <w:r>
+        <w:rPr>
+          <w:rFonts w:hint="eastAsia" w:ascii="Yu Gothic" w:hAnsi="Yu Gothic" w:eastAsia="Yu Gothic"/>
+        </w:rPr>
+        <w:t xml:space="preserve">変更できるようにする。また、将来作成するRAG・AIエージェント・自作AIアプリ向けに、</w:t>
       </w:r>
       <w:r>
         <w:rPr>
@@ -661,10 +685,31 @@
       </w:pPr>
       <w:r>
         <w:rPr>
-          <w:rFonts w:ascii="Yu Gothic" w:hAnsi="Yu Gothic" w:eastAsia="Yu Gothic"/>
-        </w:rPr>
-        <w:t xml:space="preserve">Ollama Cloudの</w:t>
-      </w:r>
+          <w:rFonts w:hint="eastAsia" w:ascii="Yu Gothic" w:hAnsi="Yu Gothic" w:eastAsia="Yu Gothic"/>
+        </w:rPr>
+        <w:t xml:space="preserve">選択したOllama</w:t>
+      </w:r>
+      <w:r>
+        <w:rPr>
+          <w:rFonts w:ascii="Yu Gothic" w:hAnsi="Yu Gothic" w:eastAsia="Yu Gothic"/>
+        </w:rPr>
+        <w:t xml:space="preserve"> CloudモデルまたはローカルモデルでCodex </w:t>
+      </w:r>
+      <w:r>
+        <w:rPr>
+          <w:rFonts w:hint="eastAsia" w:ascii="Yu Gothic" w:hAnsi="Yu Gothic" w:eastAsia="Yu Gothic"/>
+        </w:rPr>
+        <w:t xml:space="preserve">Appを起動</w:t>
+      </w:r>
+    </w:p>
+    <w:p>
+      <w:pPr>
+        <w:pStyle w:val="Compact"/>
+        <w:numPr>
+          <w:ilvl w:val="0"/>
+          <w:numId w:val="1001"/>
+        </w:numPr>
+      </w:pPr>
       <w:r>
         <w:rPr>
           <w:rStyle w:val="VerbatimChar"/>
@@ -674,15 +719,9 @@
       </w:r>
       <w:r>
         <w:rPr>
-          <w:rFonts w:ascii="Yu Gothic" w:hAnsi="Yu Gothic" w:eastAsia="Yu Gothic"/>
-        </w:rPr>
-        <w:t xml:space="preserve">でCodex </w:t>
-      </w:r>
-      <w:r>
-        <w:rPr>
-          <w:rFonts w:hint="eastAsia" w:ascii="Yu Gothic" w:hAnsi="Yu Gothic" w:eastAsia="Yu Gothic"/>
-        </w:rPr>
-        <w:t xml:space="preserve">Appを起動</w:t>
+          <w:rFonts w:hint="eastAsia" w:ascii="Yu Gothic" w:hAnsi="Yu Gothic" w:eastAsia="Yu Gothic"/>
+        </w:rPr>
+        <w:t xml:space="preserve">を初期値・推奨モデルとして表示</w:t>
       </w:r>
     </w:p>
     <w:p>
@@ -697,7 +736,7 @@
         <w:rPr>
           <w:rFonts w:hint="eastAsia" w:ascii="Yu Gothic" w:hAnsi="Yu Gothic" w:eastAsia="Yu Gothic"/>
         </w:rPr>
-        <w:t xml:space="preserve">現在のCodex接続状態を表示</w:t>
+        <w:t xml:space="preserve">推奨モデルへ戻す操作</w:t>
       </w:r>
     </w:p>
     <w:p>
@@ -710,15 +749,9 @@
       </w:pPr>
       <w:r>
         <w:rPr>
-          <w:rFonts w:ascii="Yu Gothic" w:hAnsi="Yu Gothic" w:eastAsia="Yu Gothic"/>
-        </w:rPr>
-        <w:t xml:space="preserve">Codex </w:t>
-      </w:r>
-      <w:r>
-        <w:rPr>
-          <w:rFonts w:hint="eastAsia" w:ascii="Yu Gothic" w:hAnsi="Yu Gothic" w:eastAsia="Yu Gothic"/>
-        </w:rPr>
-        <w:t xml:space="preserve">App起動中の安全な終了・再起動</w:t>
+          <w:rFonts w:hint="eastAsia" w:ascii="Yu Gothic" w:hAnsi="Yu Gothic" w:eastAsia="Yu Gothic"/>
+        </w:rPr>
+        <w:t xml:space="preserve">Cloudモデルを優先したモデル選択画面</w:t>
       </w:r>
     </w:p>
     <w:p>
@@ -733,7 +766,7 @@
         <w:rPr>
           <w:rFonts w:hint="eastAsia" w:ascii="Yu Gothic" w:hAnsi="Yu Gothic" w:eastAsia="Yu Gothic"/>
         </w:rPr>
-        <w:t xml:space="preserve">Ollama未導入・未起動・旧バージョンの案内</w:t>
+        <w:t xml:space="preserve">ローカルモデルと手入力を詳細設定へ分離</w:t>
       </w:r>
     </w:p>
     <w:p>
@@ -748,7 +781,7 @@
         <w:rPr>
           <w:rFonts w:hint="eastAsia" w:ascii="Yu Gothic" w:hAnsi="Yu Gothic" w:eastAsia="Yu Gothic"/>
         </w:rPr>
-        <w:t xml:space="preserve">インストール済みOllamaモデルの一覧表示</w:t>
+        <w:t xml:space="preserve">選択モデル名、種類、準備状態の表示・保存</w:t>
       </w:r>
     </w:p>
     <w:p>
@@ -763,7 +796,7 @@
         <w:rPr>
           <w:rFonts w:hint="eastAsia" w:ascii="Yu Gothic" w:hAnsi="Yu Gothic" w:eastAsia="Yu Gothic"/>
         </w:rPr>
-        <w:t xml:space="preserve">Cloudモデルとローカルモデルの区別</w:t>
+        <w:t xml:space="preserve">未準備モデルの起動拒否とモデル管理画面への案内</w:t>
       </w:r>
     </w:p>
     <w:p>
@@ -778,7 +811,37 @@
         <w:rPr>
           <w:rFonts w:hint="eastAsia" w:ascii="Yu Gothic" w:hAnsi="Yu Gothic" w:eastAsia="Yu Gothic"/>
         </w:rPr>
-        <w:t xml:space="preserve">手入力したモデルのインストール、進捗表示、中止</w:t>
+        <w:t xml:space="preserve">ローカルモデル選択時・起動時の警告</w:t>
+      </w:r>
+    </w:p>
+    <w:p>
+      <w:pPr>
+        <w:pStyle w:val="Compact"/>
+        <w:numPr>
+          <w:ilvl w:val="0"/>
+          <w:numId w:val="1001"/>
+        </w:numPr>
+      </w:pPr>
+      <w:r>
+        <w:rPr>
+          <w:rFonts w:hint="eastAsia" w:ascii="Yu Gothic" w:hAnsi="Yu Gothic" w:eastAsia="Yu Gothic"/>
+        </w:rPr>
+        <w:t xml:space="preserve">現在のCodex接続状態表示</w:t>
+      </w:r>
+    </w:p>
+    <w:p>
+      <w:pPr>
+        <w:pStyle w:val="Compact"/>
+        <w:numPr>
+          <w:ilvl w:val="0"/>
+          <w:numId w:val="1001"/>
+        </w:numPr>
+      </w:pPr>
+      <w:r>
+        <w:rPr>
+          <w:rFonts w:hint="eastAsia" w:ascii="Yu Gothic" w:hAnsi="Yu Gothic" w:eastAsia="Yu Gothic"/>
+        </w:rPr>
+        <w:t xml:space="preserve">Ollamaモデル一覧、インストール、進捗表示、中止</w:t>
       </w:r>
     </w:p>
     <w:p>
@@ -827,7 +890,7 @@
         <w:rPr>
           <w:rFonts w:hint="eastAsia" w:ascii="Yu Gothic" w:hAnsi="Yu Gothic" w:eastAsia="Yu Gothic"/>
         </w:rPr>
-        <w:t xml:space="preserve">Windows対応</w:t>
+        <w:t xml:space="preserve">Windows対応・EXE配布</w:t>
       </w:r>
     </w:p>
     <w:p>
@@ -870,15 +933,9 @@
       </w:pPr>
       <w:r>
         <w:rPr>
-          <w:rFonts w:ascii="Yu Gothic" w:hAnsi="Yu Gothic" w:eastAsia="Yu Gothic"/>
-        </w:rPr>
-        <w:t xml:space="preserve">Codex </w:t>
-      </w:r>
-      <w:r>
-        <w:rPr>
-          <w:rFonts w:hint="eastAsia" w:ascii="Yu Gothic" w:hAnsi="Yu Gothic" w:eastAsia="Yu Gothic"/>
-        </w:rPr>
-        <w:t xml:space="preserve">Appで使用するモデルの自由選択</w:t>
+          <w:rFonts w:hint="eastAsia" w:ascii="Yu Gothic" w:hAnsi="Yu Gothic" w:eastAsia="Yu Gothic"/>
+        </w:rPr>
+        <w:t xml:space="preserve">モデルごとのCodex互換性保証</w:t>
       </w:r>
     </w:p>
     <w:p>
@@ -912,20 +969,14 @@
       </w:pPr>
       <w:r>
         <w:rPr>
-          <w:rFonts w:ascii="Yu Gothic" w:hAnsi="Yu Gothic" w:eastAsia="Yu Gothic"/>
-        </w:rPr>
-        <w:t xml:space="preserve">OllamaまたはCodex </w:t>
-      </w:r>
-      <w:r>
-        <w:rPr>
-          <w:rFonts w:hint="eastAsia" w:ascii="Yu Gothic" w:hAnsi="Yu Gothic" w:eastAsia="Yu Gothic"/>
-        </w:rPr>
-        <w:t xml:space="preserve">Appのアカウント作成・サインイン</w:t>
+          <w:rFonts w:hint="eastAsia" w:ascii="Yu Gothic" w:hAnsi="Yu Gothic" w:eastAsia="Yu Gothic"/>
+        </w:rPr>
+        <w:t xml:space="preserve">アカウント作成・サインイン</w:t>
       </w:r>
     </w:p>
     <w:bookmarkEnd w:id="12"/>
     <w:bookmarkEnd w:id="13"/>
-    <w:bookmarkStart w:id="16" w:name="Xdab907793cc5b7aa5fc9ef022e41590d2626fc9"/>
+    <w:bookmarkStart w:id="17" w:name="X4ff43a7cd062e28dac63a693fd5d852ade50d62"/>
     <w:p>
       <w:pPr>
         <w:pStyle w:val="Heading2"/>
@@ -940,10 +991,10 @@
         <w:rPr>
           <w:rFonts w:hint="eastAsia" w:ascii="Yu Gothic" w:hAnsi="Yu Gothic" w:eastAsia="Yu Gothic"/>
         </w:rPr>
-        <w:t xml:space="preserve">画面構成</w:t>
-      </w:r>
-    </w:p>
-    <w:bookmarkStart w:id="14" w:name="Xf6081897a854b15a548f5de05a2695f15897b94"/>
+        <w:t xml:space="preserve">UI方針</w:t>
+      </w:r>
+    </w:p>
+    <w:bookmarkStart w:id="14" w:name="X90b7e89458614233bdf238dd1b34a1e90cd29c7"/>
     <w:p>
       <w:pPr>
         <w:pStyle w:val="Heading3"/>
@@ -952,13 +1003,13 @@
         <w:rPr>
           <w:rFonts w:ascii="Yu Gothic" w:hAnsi="Yu Gothic" w:eastAsia="Yu Gothic"/>
         </w:rPr>
-        <w:t xml:space="preserve">4.1 Codex App </w:t>
-      </w:r>
-      <w:r>
-        <w:rPr>
-          <w:rFonts w:hint="eastAsia" w:ascii="Yu Gothic" w:hAnsi="Yu Gothic" w:eastAsia="Yu Gothic"/>
-        </w:rPr>
-        <w:t xml:space="preserve">かんたん切り替えタブ</w:t>
+        <w:t xml:space="preserve">4.1 </w:t>
+      </w:r>
+      <w:r>
+        <w:rPr>
+          <w:rFonts w:hint="eastAsia" w:ascii="Yu Gothic" w:hAnsi="Yu Gothic" w:eastAsia="Yu Gothic"/>
+        </w:rPr>
+        <w:t xml:space="preserve">メイン画面</w:t>
       </w:r>
     </w:p>
     <w:p>
@@ -973,7 +1024,19 @@
         <w:rPr>
           <w:rFonts w:hint="eastAsia" w:ascii="Yu Gothic" w:hAnsi="Yu Gothic" w:eastAsia="Yu Gothic"/>
         </w:rPr>
-        <w:t xml:space="preserve">現在の接続状態</w:t>
+        <w:t xml:space="preserve">現在のCodex</w:t>
+      </w:r>
+      <w:r>
+        <w:rPr>
+          <w:rFonts w:ascii="Yu Gothic" w:hAnsi="Yu Gothic" w:eastAsia="Yu Gothic"/>
+        </w:rPr>
+        <w:t xml:space="preserve"> </w:t>
+      </w:r>
+      <w:r>
+        <w:rPr>
+          <w:rFonts w:hint="eastAsia" w:ascii="Yu Gothic" w:hAnsi="Yu Gothic" w:eastAsia="Yu Gothic"/>
+        </w:rPr>
+        <w:t xml:space="preserve">App接続状態とモデル名</w:t>
       </w:r>
     </w:p>
     <w:p>
@@ -988,7 +1051,19 @@
         <w:rPr>
           <w:rFonts w:hint="eastAsia" w:ascii="Yu Gothic" w:hAnsi="Yu Gothic" w:eastAsia="Yu Gothic"/>
         </w:rPr>
-        <w:t xml:space="preserve">現在のモデル名</w:t>
+        <w:t xml:space="preserve">「通常のCodex</w:t>
+      </w:r>
+      <w:r>
+        <w:rPr>
+          <w:rFonts w:ascii="Yu Gothic" w:hAnsi="Yu Gothic" w:eastAsia="Yu Gothic"/>
+        </w:rPr>
+        <w:t xml:space="preserve"> </w:t>
+      </w:r>
+      <w:r>
+        <w:rPr>
+          <w:rFonts w:hint="eastAsia" w:ascii="Yu Gothic" w:hAnsi="Yu Gothic" w:eastAsia="Yu Gothic"/>
+        </w:rPr>
+        <w:t xml:space="preserve">GPTで起動」</w:t>
       </w:r>
     </w:p>
     <w:p>
@@ -1003,7 +1078,90 @@
         <w:rPr>
           <w:rFonts w:hint="eastAsia" w:ascii="Yu Gothic" w:hAnsi="Yu Gothic" w:eastAsia="Yu Gothic"/>
         </w:rPr>
-        <w:t xml:space="preserve">「通常のCodex</w:t>
+        <w:t xml:space="preserve">「選択中のOllamaモデルで起動」</w:t>
+      </w:r>
+    </w:p>
+    <w:p>
+      <w:pPr>
+        <w:pStyle w:val="Compact"/>
+        <w:numPr>
+          <w:ilvl w:val="0"/>
+          <w:numId w:val="1003"/>
+        </w:numPr>
+      </w:pPr>
+      <w:r>
+        <w:rPr>
+          <w:rFonts w:hint="eastAsia" w:ascii="Yu Gothic" w:hAnsi="Yu Gothic" w:eastAsia="Yu Gothic"/>
+        </w:rPr>
+        <w:t xml:space="preserve">選択中のモデル名、Cloud</w:t>
+      </w:r>
+      <w:r>
+        <w:rPr>
+          <w:rFonts w:ascii="Yu Gothic" w:hAnsi="Yu Gothic" w:eastAsia="Yu Gothic"/>
+        </w:rPr>
+        <w:t xml:space="preserve"> / </w:t>
+      </w:r>
+      <w:r>
+        <w:rPr>
+          <w:rFonts w:hint="eastAsia" w:ascii="Yu Gothic" w:hAnsi="Yu Gothic" w:eastAsia="Yu Gothic"/>
+        </w:rPr>
+        <w:t xml:space="preserve">ローカル種別、推奨状態、準備状態</w:t>
+      </w:r>
+    </w:p>
+    <w:p>
+      <w:pPr>
+        <w:pStyle w:val="Compact"/>
+        <w:numPr>
+          <w:ilvl w:val="0"/>
+          <w:numId w:val="1003"/>
+        </w:numPr>
+      </w:pPr>
+      <w:r>
+        <w:rPr>
+          <w:rFonts w:hint="eastAsia" w:ascii="Yu Gothic" w:hAnsi="Yu Gothic" w:eastAsia="Yu Gothic"/>
+        </w:rPr>
+        <w:t xml:space="preserve">「モデルを変更」</w:t>
+      </w:r>
+    </w:p>
+    <w:p>
+      <w:pPr>
+        <w:pStyle w:val="Compact"/>
+        <w:numPr>
+          <w:ilvl w:val="0"/>
+          <w:numId w:val="1003"/>
+        </w:numPr>
+      </w:pPr>
+      <w:r>
+        <w:rPr>
+          <w:rFonts w:hint="eastAsia" w:ascii="Yu Gothic" w:hAnsi="Yu Gothic" w:eastAsia="Yu Gothic"/>
+        </w:rPr>
+        <w:t xml:space="preserve">「推奨モデルに戻す」</w:t>
+      </w:r>
+    </w:p>
+    <w:p>
+      <w:pPr>
+        <w:pStyle w:val="Compact"/>
+        <w:numPr>
+          <w:ilvl w:val="0"/>
+          <w:numId w:val="1003"/>
+        </w:numPr>
+      </w:pPr>
+      <w:r>
+        <w:rPr>
+          <w:rFonts w:hint="eastAsia" w:ascii="Yu Gothic" w:hAnsi="Yu Gothic" w:eastAsia="Yu Gothic"/>
+        </w:rPr>
+        <w:t xml:space="preserve">状態・結果表示</w:t>
+      </w:r>
+    </w:p>
+    <w:p>
+      <w:pPr>
+        <w:pStyle w:val="FirstParagraph"/>
+      </w:pPr>
+      <w:r>
+        <w:rPr>
+          <w:rFonts w:hint="eastAsia" w:ascii="Yu Gothic" w:hAnsi="Yu Gothic" w:eastAsia="Yu Gothic"/>
+        </w:rPr>
+        <w:t xml:space="preserve">モデルを変更しただけではCodex</w:t>
       </w:r>
       <w:r>
         <w:rPr>
@@ -1015,71 +1173,11 @@
         <w:rPr>
           <w:rFonts w:hint="eastAsia" w:ascii="Yu Gothic" w:hAnsi="Yu Gothic" w:eastAsia="Yu Gothic"/>
         </w:rPr>
-        <w:t xml:space="preserve">GPTで起動」ボタン</w:t>
-      </w:r>
-    </w:p>
-    <w:p>
-      <w:pPr>
-        <w:pStyle w:val="Compact"/>
-        <w:numPr>
-          <w:ilvl w:val="0"/>
-          <w:numId w:val="1003"/>
-        </w:numPr>
-      </w:pPr>
-      <w:r>
-        <w:rPr>
-          <w:rFonts w:hint="eastAsia" w:ascii="Yu Gothic" w:hAnsi="Yu Gothic" w:eastAsia="Yu Gothic"/>
-        </w:rPr>
-        <w:t xml:space="preserve">「gpt-oss:120b-cloudで起動」ボタン</w:t>
-      </w:r>
-    </w:p>
-    <w:p>
-      <w:pPr>
-        <w:pStyle w:val="Compact"/>
-        <w:numPr>
-          <w:ilvl w:val="0"/>
-          <w:numId w:val="1003"/>
-        </w:numPr>
-      </w:pPr>
-      <w:r>
-        <w:rPr>
-          <w:rFonts w:hint="eastAsia" w:ascii="Yu Gothic" w:hAnsi="Yu Gothic" w:eastAsia="Yu Gothic"/>
-        </w:rPr>
-        <w:t xml:space="preserve">「状態を再確認」ボタン</w:t>
-      </w:r>
-    </w:p>
-    <w:p>
-      <w:pPr>
-        <w:pStyle w:val="Compact"/>
-        <w:numPr>
-          <w:ilvl w:val="0"/>
-          <w:numId w:val="1003"/>
-        </w:numPr>
-      </w:pPr>
-      <w:r>
-        <w:rPr>
-          <w:rFonts w:hint="eastAsia" w:ascii="Yu Gothic" w:hAnsi="Yu Gothic" w:eastAsia="Yu Gothic"/>
-        </w:rPr>
-        <w:t xml:space="preserve">状態・結果表示欄</w:t>
-      </w:r>
-    </w:p>
-    <w:p>
-      <w:pPr>
-        <w:pStyle w:val="Compact"/>
-        <w:numPr>
-          <w:ilvl w:val="0"/>
-          <w:numId w:val="1003"/>
-        </w:numPr>
-      </w:pPr>
-      <w:r>
-        <w:rPr>
-          <w:rFonts w:hint="eastAsia" w:ascii="Yu Gothic" w:hAnsi="Yu Gothic" w:eastAsia="Yu Gothic"/>
-        </w:rPr>
-        <w:t xml:space="preserve">Ollama未導入時の公式ダウンロードページボタン</w:t>
+        <w:t xml:space="preserve">Appを終了・再起動しない。</w:t>
       </w:r>
     </w:p>
     <w:bookmarkEnd w:id="14"/>
-    <w:bookmarkStart w:id="15" w:name="Xcaaced21b36989c6f52284104a6dacc1bae5c06"/>
+    <w:bookmarkStart w:id="15" w:name="X1bf1432571d982ad86b413d85e39e8d3d87517c"/>
     <w:p>
       <w:pPr>
         <w:pStyle w:val="Heading3"/>
@@ -1088,13 +1186,13 @@
         <w:rPr>
           <w:rFonts w:ascii="Yu Gothic" w:hAnsi="Yu Gothic" w:eastAsia="Yu Gothic"/>
         </w:rPr>
-        <w:t xml:space="preserve">4.2 Ollama </w:t>
-      </w:r>
-      <w:r>
-        <w:rPr>
-          <w:rFonts w:hint="eastAsia" w:ascii="Yu Gothic" w:hAnsi="Yu Gothic" w:eastAsia="Yu Gothic"/>
-        </w:rPr>
-        <w:t xml:space="preserve">モデル管理タブ</w:t>
+        <w:t xml:space="preserve">4.2 </w:t>
+      </w:r>
+      <w:r>
+        <w:rPr>
+          <w:rFonts w:hint="eastAsia" w:ascii="Yu Gothic" w:hAnsi="Yu Gothic" w:eastAsia="Yu Gothic"/>
+        </w:rPr>
+        <w:t xml:space="preserve">モデル選択画面</w:t>
       </w:r>
     </w:p>
     <w:p>
@@ -1109,7 +1207,20 @@
         <w:rPr>
           <w:rFonts w:hint="eastAsia" w:ascii="Yu Gothic" w:hAnsi="Yu Gothic" w:eastAsia="Yu Gothic"/>
         </w:rPr>
-        <w:t xml:space="preserve">モデル名入力欄</w:t>
+        <w:t xml:space="preserve">推奨・動作確認済みモデルとして</w:t>
+      </w:r>
+      <w:r>
+        <w:rPr>
+          <w:rStyle w:val="VerbatimChar"/>
+          <w:rFonts w:ascii="Yu Gothic" w:hAnsi="Yu Gothic" w:eastAsia="Yu Gothic"/>
+        </w:rPr>
+        <w:t xml:space="preserve">gpt-oss:120b-cloud</w:t>
+      </w:r>
+      <w:r>
+        <w:rPr>
+          <w:rFonts w:hint="eastAsia" w:ascii="Yu Gothic" w:hAnsi="Yu Gothic" w:eastAsia="Yu Gothic"/>
+        </w:rPr>
+        <w:t xml:space="preserve">を最上部に固定表示する。</w:t>
       </w:r>
     </w:p>
     <w:p>
@@ -1122,9 +1233,9 @@
       </w:pPr>
       <w:r>
         <w:rPr>
-          <w:rFonts w:ascii="Yu Gothic" w:hAnsi="Yu Gothic" w:eastAsia="Yu Gothic"/>
-        </w:rPr>
-        <w:t xml:space="preserve">「モデルをインストール」ボタン</w:t>
+          <w:rFonts w:hint="eastAsia" w:ascii="Yu Gothic" w:hAnsi="Yu Gothic" w:eastAsia="Yu Gothic"/>
+        </w:rPr>
+        <w:t xml:space="preserve">インストール済みCloudモデルを通常表示する。</w:t>
       </w:r>
     </w:p>
     <w:p>
@@ -1139,7 +1250,7 @@
         <w:rPr>
           <w:rFonts w:hint="eastAsia" w:ascii="Yu Gothic" w:hAnsi="Yu Gothic" w:eastAsia="Yu Gothic"/>
         </w:rPr>
-        <w:t xml:space="preserve">インストール済みモデル一覧</w:t>
+        <w:t xml:space="preserve">ローカルモデルとモデル名の手入力は「詳細設定」に格納する。</w:t>
       </w:r>
     </w:p>
     <w:p>
@@ -1152,6 +1263,70 @@
       </w:pPr>
       <w:r>
         <w:rPr>
+          <w:rFonts w:hint="eastAsia" w:ascii="Yu Gothic" w:hAnsi="Yu Gothic" w:eastAsia="Yu Gothic"/>
+        </w:rPr>
+        <w:t xml:space="preserve">ローカルモデル選択時はCodex機能が正常に動作しない可能性を警告する。</w:t>
+      </w:r>
+    </w:p>
+    <w:bookmarkEnd w:id="15"/>
+    <w:bookmarkStart w:id="16" w:name="X928ad98fcd0f3f636e58afdbd34392d3300b6fd"/>
+    <w:p>
+      <w:pPr>
+        <w:pStyle w:val="Heading3"/>
+      </w:pPr>
+      <w:r>
+        <w:rPr>
+          <w:rFonts w:ascii="Yu Gothic" w:hAnsi="Yu Gothic" w:eastAsia="Yu Gothic"/>
+        </w:rPr>
+        <w:t xml:space="preserve">4.3 </w:t>
+      </w:r>
+      <w:r>
+        <w:rPr>
+          <w:rFonts w:hint="eastAsia" w:ascii="Yu Gothic" w:hAnsi="Yu Gothic" w:eastAsia="Yu Gothic"/>
+        </w:rPr>
+        <w:t xml:space="preserve">Ollamaモデル管理画面</w:t>
+      </w:r>
+    </w:p>
+    <w:p>
+      <w:pPr>
+        <w:pStyle w:val="Compact"/>
+        <w:numPr>
+          <w:ilvl w:val="0"/>
+          <w:numId w:val="1005"/>
+        </w:numPr>
+      </w:pPr>
+      <w:r>
+        <w:rPr>
+          <w:rFonts w:hint="eastAsia" w:ascii="Yu Gothic" w:hAnsi="Yu Gothic" w:eastAsia="Yu Gothic"/>
+        </w:rPr>
+        <w:t xml:space="preserve">手入力したモデルのインストール</w:t>
+      </w:r>
+    </w:p>
+    <w:p>
+      <w:pPr>
+        <w:pStyle w:val="Compact"/>
+        <w:numPr>
+          <w:ilvl w:val="0"/>
+          <w:numId w:val="1005"/>
+        </w:numPr>
+      </w:pPr>
+      <w:r>
+        <w:rPr>
+          <w:rFonts w:hint="eastAsia" w:ascii="Yu Gothic" w:hAnsi="Yu Gothic" w:eastAsia="Yu Gothic"/>
+        </w:rPr>
+        <w:t xml:space="preserve">Cloud優先のモデル一覧</w:t>
+      </w:r>
+    </w:p>
+    <w:p>
+      <w:pPr>
+        <w:pStyle w:val="Compact"/>
+        <w:numPr>
+          <w:ilvl w:val="0"/>
+          <w:numId w:val="1005"/>
+        </w:numPr>
+      </w:pPr>
+      <w:r>
+        <w:rPr>
           <w:rFonts w:ascii="Yu Gothic" w:hAnsi="Yu Gothic" w:eastAsia="Yu Gothic"/>
         </w:rPr>
         <w:t xml:space="preserve">Cloud / </w:t>
@@ -1168,19 +1343,19 @@
         <w:pStyle w:val="Compact"/>
         <w:numPr>
           <w:ilvl w:val="0"/>
-          <w:numId w:val="1004"/>
-        </w:numPr>
-      </w:pPr>
-      <w:r>
-        <w:rPr>
-          <w:rFonts w:hint="eastAsia" w:ascii="Yu Gothic" w:hAnsi="Yu Gothic" w:eastAsia="Yu Gothic"/>
-        </w:rPr>
-        <w:t xml:space="preserve">インストール進捗、結果、中止ボタン</w:t>
-      </w:r>
-    </w:p>
-    <w:bookmarkEnd w:id="15"/>
+          <w:numId w:val="1005"/>
+        </w:numPr>
+      </w:pPr>
+      <w:r>
+        <w:rPr>
+          <w:rFonts w:hint="eastAsia" w:ascii="Yu Gothic" w:hAnsi="Yu Gothic" w:eastAsia="Yu Gothic"/>
+        </w:rPr>
+        <w:t xml:space="preserve">インストール進捗、結果、中止</w:t>
+      </w:r>
+    </w:p>
     <w:bookmarkEnd w:id="16"/>
-    <w:bookmarkStart w:id="20" w:name="X126e3a2ac79ca71e34ae7724bb33ae78a6d44e8"/>
+    <w:bookmarkEnd w:id="17"/>
+    <w:bookmarkStart w:id="21" w:name="X126e3a2ac79ca71e34ae7724bb33ae78a6d44e8"/>
     <w:p>
       <w:pPr>
         <w:pStyle w:val="Heading2"/>
@@ -1198,7 +1373,7 @@
         <w:t xml:space="preserve">接続切り替え仕様</w:t>
       </w:r>
     </w:p>
-    <w:bookmarkStart w:id="17" w:name="X6ff628d27e0982d171d6de4c0ab410c7f9e8169"/>
+    <w:bookmarkStart w:id="18" w:name="X6ff628d27e0982d171d6de4c0ab410c7f9e8169"/>
     <w:p>
       <w:pPr>
         <w:pStyle w:val="Heading3"/>
@@ -1220,17 +1395,6 @@
           <w:rFonts w:ascii="Yu Gothic" w:hAnsi="Yu Gothic" w:eastAsia="Yu Gothic"/>
         </w:rPr>
         <w:t xml:space="preserve"> GPT</w:t>
-      </w:r>
-    </w:p>
-    <w:p>
-      <w:pPr>
-        <w:pStyle w:val="FirstParagraph"/>
-      </w:pPr>
-      <w:r>
-        <w:rPr>
-          <w:rFonts w:hint="eastAsia" w:ascii="Yu Gothic" w:hAnsi="Yu Gothic" w:eastAsia="Yu Gothic"/>
-        </w:rPr>
-        <w:t xml:space="preserve">Ollama公式機能を次の引数リストで実行する。</w:t>
       </w:r>
     </w:p>
     <w:p>
@@ -1247,8 +1411,8 @@
         <w:t xml:space="preserve">ollama launch codex-app --restore --yes</w:t>
       </w:r>
     </w:p>
-    <w:bookmarkEnd w:id="17"/>
-    <w:bookmarkStart w:id="18" w:name="X1e8237169be0071471df315a180ba41e0000d65"/>
+    <w:bookmarkEnd w:id="18"/>
+    <w:bookmarkStart w:id="19" w:name="Xddc87124a5135e7dae6dbb61f7d4dda1ad0d6eb"/>
     <w:p>
       <w:pPr>
         <w:pStyle w:val="Heading3"/>
@@ -1257,18 +1421,13 @@
         <w:rPr>
           <w:rFonts w:ascii="Yu Gothic" w:hAnsi="Yu Gothic" w:eastAsia="Yu Gothic"/>
         </w:rPr>
-        <w:t xml:space="preserve">5.2 Ollama Cloud</w:t>
-      </w:r>
-    </w:p>
-    <w:p>
-      <w:pPr>
-        <w:pStyle w:val="FirstParagraph"/>
-      </w:pPr>
-      <w:r>
-        <w:rPr>
-          <w:rFonts w:hint="eastAsia" w:ascii="Yu Gothic" w:hAnsi="Yu Gothic" w:eastAsia="Yu Gothic"/>
-        </w:rPr>
-        <w:t xml:space="preserve">Ollama公式機能を次の引数リストで実行する。</w:t>
+        <w:t xml:space="preserve">5.2 </w:t>
+      </w:r>
+      <w:r>
+        <w:rPr>
+          <w:rFonts w:hint="eastAsia" w:ascii="Yu Gothic" w:hAnsi="Yu Gothic" w:eastAsia="Yu Gothic"/>
+        </w:rPr>
+        <w:t xml:space="preserve">選択したOllamaモデル</w:t>
       </w:r>
     </w:p>
     <w:p>
@@ -1282,380 +1441,412 @@
           <w:rFonts w:ascii="Menlo" w:hAnsi="Menlo" w:eastAsia="Menlo"/>
           <w:sz w:val="18"/>
         </w:rPr>
-        <w:t xml:space="preserve">ollama launch codex-app --model gpt-oss:120b-cloud --yes</w:t>
-      </w:r>
-    </w:p>
-    <w:bookmarkEnd w:id="18"/>
-    <w:bookmarkStart w:id="19" w:name="X1ff598ccecc285a210fb1d29514cc2582b82474"/>
-    <w:p>
-      <w:pPr>
-        <w:pStyle w:val="Heading3"/>
-      </w:pPr>
-      <w:r>
-        <w:rPr>
-          <w:rFonts w:ascii="Yu Gothic" w:hAnsi="Yu Gothic" w:eastAsia="Yu Gothic"/>
-        </w:rPr>
-        <w:t xml:space="preserve">5.3 </w:t>
-      </w:r>
-      <w:r>
-        <w:rPr>
-          <w:rFonts w:hint="eastAsia" w:ascii="Yu Gothic" w:hAnsi="Yu Gothic" w:eastAsia="Yu Gothic"/>
-        </w:rPr>
-        <w:t xml:space="preserve">切り替え前処理</w:t>
-      </w:r>
-    </w:p>
-    <w:p>
-      <w:pPr>
-        <w:pStyle w:val="Compact"/>
-        <w:numPr>
-          <w:ilvl w:val="0"/>
-          <w:numId w:val="1005"/>
-        </w:numPr>
-      </w:pPr>
-      <w:r>
-        <w:rPr>
-          <w:rFonts w:hint="eastAsia" w:ascii="Yu Gothic" w:hAnsi="Yu Gothic" w:eastAsia="Yu Gothic"/>
-        </w:rPr>
-        <w:t xml:space="preserve">選択済み接続先と現在状態が同じ場合、設定変更は行わずCodex</w:t>
-      </w:r>
-      <w:r>
-        <w:rPr>
-          <w:rFonts w:ascii="Yu Gothic" w:hAnsi="Yu Gothic" w:eastAsia="Yu Gothic"/>
-        </w:rPr>
-        <w:t xml:space="preserve"> </w:t>
-      </w:r>
-      <w:r>
-        <w:rPr>
-          <w:rFonts w:hint="eastAsia" w:ascii="Yu Gothic" w:hAnsi="Yu Gothic" w:eastAsia="Yu Gothic"/>
-        </w:rPr>
-        <w:t xml:space="preserve">Appを起動する。</w:t>
-      </w:r>
-    </w:p>
-    <w:p>
-      <w:pPr>
-        <w:pStyle w:val="Compact"/>
-        <w:numPr>
-          <w:ilvl w:val="0"/>
-          <w:numId w:val="1005"/>
-        </w:numPr>
-      </w:pPr>
-      <w:r>
-        <w:rPr>
-          <w:rFonts w:hint="eastAsia" w:ascii="Yu Gothic" w:hAnsi="Yu Gothic" w:eastAsia="Yu Gothic"/>
-        </w:rPr>
-        <w:t xml:space="preserve">接続先が異なりCodex</w:t>
-      </w:r>
-      <w:r>
-        <w:rPr>
-          <w:rFonts w:ascii="Yu Gothic" w:hAnsi="Yu Gothic" w:eastAsia="Yu Gothic"/>
-        </w:rPr>
-        <w:t xml:space="preserve"> </w:t>
-      </w:r>
-      <w:r>
-        <w:rPr>
-          <w:rFonts w:hint="eastAsia" w:ascii="Yu Gothic" w:hAnsi="Yu Gothic" w:eastAsia="Yu Gothic"/>
-        </w:rPr>
-        <w:t xml:space="preserve">Appが起動中の場合、入力途中の内容が失われる可能性を警告する。</w:t>
-      </w:r>
-    </w:p>
-    <w:p>
-      <w:pPr>
-        <w:pStyle w:val="Compact"/>
-        <w:numPr>
-          <w:ilvl w:val="0"/>
-          <w:numId w:val="1005"/>
-        </w:numPr>
-      </w:pPr>
-      <w:r>
-        <w:rPr>
-          <w:rFonts w:hint="eastAsia" w:ascii="Yu Gothic" w:hAnsi="Yu Gothic" w:eastAsia="Yu Gothic"/>
-        </w:rPr>
-        <w:t xml:space="preserve">利用者が承認した場合のみ、AppleScriptでCodex</w:t>
-      </w:r>
-      <w:r>
-        <w:rPr>
-          <w:rFonts w:ascii="Yu Gothic" w:hAnsi="Yu Gothic" w:eastAsia="Yu Gothic"/>
-        </w:rPr>
-        <w:t xml:space="preserve"> </w:t>
-      </w:r>
-      <w:r>
-        <w:rPr>
-          <w:rFonts w:hint="eastAsia" w:ascii="Yu Gothic" w:hAnsi="Yu Gothic" w:eastAsia="Yu Gothic"/>
-        </w:rPr>
-        <w:t xml:space="preserve">Appを通常終了する。</w:t>
-      </w:r>
-    </w:p>
-    <w:p>
-      <w:pPr>
-        <w:pStyle w:val="Compact"/>
-        <w:numPr>
-          <w:ilvl w:val="0"/>
-          <w:numId w:val="1005"/>
-        </w:numPr>
-      </w:pPr>
-      <w:r>
-        <w:rPr>
-          <w:rFonts w:hint="eastAsia" w:ascii="Yu Gothic" w:hAnsi="Yu Gothic" w:eastAsia="Yu Gothic"/>
-        </w:rPr>
-        <w:t xml:space="preserve">Ollama公式コマンドで切り替える。</w:t>
-      </w:r>
-    </w:p>
-    <w:p>
-      <w:pPr>
-        <w:pStyle w:val="Compact"/>
-        <w:numPr>
-          <w:ilvl w:val="0"/>
-          <w:numId w:val="1005"/>
-        </w:numPr>
-      </w:pPr>
-      <w:r>
-        <w:rPr>
-          <w:rFonts w:hint="eastAsia" w:ascii="Yu Gothic" w:hAnsi="Yu Gothic" w:eastAsia="Yu Gothic"/>
-        </w:rPr>
-        <w:t xml:space="preserve">設定状態を読み取り確認し、Codex</w:t>
-      </w:r>
-      <w:r>
-        <w:rPr>
-          <w:rFonts w:ascii="Yu Gothic" w:hAnsi="Yu Gothic" w:eastAsia="Yu Gothic"/>
-        </w:rPr>
-        <w:t xml:space="preserve"> </w:t>
-      </w:r>
-      <w:r>
-        <w:rPr>
-          <w:rFonts w:hint="eastAsia" w:ascii="Yu Gothic" w:hAnsi="Yu Gothic" w:eastAsia="Yu Gothic"/>
-        </w:rPr>
-        <w:t xml:space="preserve">Appを起動する。</w:t>
-      </w:r>
-    </w:p>
-    <w:bookmarkEnd w:id="19"/>
-    <w:bookmarkEnd w:id="20"/>
-    <w:bookmarkStart w:id="21" w:name="X5f970d00d09077f4ff19a42fc475c1269468d4e"/>
-    <w:p>
-      <w:pPr>
-        <w:pStyle w:val="Heading2"/>
-      </w:pPr>
-      <w:r>
-        <w:rPr>
-          <w:rFonts w:ascii="Yu Gothic" w:hAnsi="Yu Gothic" w:eastAsia="Yu Gothic"/>
-        </w:rPr>
-        <w:t xml:space="preserve">6. </w:t>
-      </w:r>
-      <w:r>
-        <w:rPr>
-          <w:rFonts w:hint="eastAsia" w:ascii="Yu Gothic" w:hAnsi="Yu Gothic" w:eastAsia="Yu Gothic"/>
-        </w:rPr>
-        <w:t xml:space="preserve">モデル管理仕様</w:t>
-      </w:r>
-    </w:p>
-    <w:p>
-      <w:pPr>
-        <w:pStyle w:val="Compact"/>
-        <w:numPr>
-          <w:ilvl w:val="0"/>
-          <w:numId w:val="1006"/>
-        </w:numPr>
-      </w:pPr>
-      <w:r>
-        <w:rPr>
-          <w:rFonts w:hint="eastAsia" w:ascii="Yu Gothic" w:hAnsi="Yu Gothic" w:eastAsia="Yu Gothic"/>
-        </w:rPr>
-        <w:t xml:space="preserve">モデル名は英数字と</w:t>
+        <w:t xml:space="preserve">ollama launch codex-app --model </w:t>
       </w:r>
       <w:r>
         <w:rPr>
           <w:rStyle w:val="VerbatimChar"/>
-          <w:rFonts w:ascii="Yu Gothic" w:hAnsi="Yu Gothic" w:eastAsia="Yu Gothic"/>
-        </w:rPr>
-        <w:t xml:space="preserve">. _ : / -</w:t>
-      </w:r>
-      <w:r>
-        <w:rPr>
-          <w:rFonts w:hint="eastAsia" w:ascii="Yu Gothic" w:hAnsi="Yu Gothic" w:eastAsia="Yu Gothic"/>
-        </w:rPr>
-        <w:t xml:space="preserve">のみ許可し、最大200文字とする。</w:t>
-      </w:r>
-    </w:p>
-    <w:p>
-      <w:pPr>
-        <w:pStyle w:val="Compact"/>
-        <w:numPr>
-          <w:ilvl w:val="0"/>
-          <w:numId w:val="1006"/>
-        </w:numPr>
-      </w:pPr>
-      <w:r>
-        <w:rPr>
-          <w:rFonts w:ascii="Yu Gothic" w:hAnsi="Yu Gothic" w:eastAsia="Yu Gothic"/>
-        </w:rPr>
-        <w:t xml:space="preserve">インストールは</w:t>
-      </w:r>
-      <w:r>
-        <w:rPr>
-          <w:rStyle w:val="VerbatimChar"/>
-          <w:rFonts w:ascii="Yu Gothic" w:hAnsi="Yu Gothic" w:eastAsia="Yu Gothic"/>
-        </w:rPr>
-        <w:t xml:space="preserve">ollama pull </w:t>
-      </w:r>
-      <w:r>
-        <w:rPr>
-          <w:rStyle w:val="VerbatimChar"/>
-          <w:rFonts w:hint="eastAsia" w:ascii="Yu Gothic" w:hAnsi="Yu Gothic" w:eastAsia="Yu Gothic"/>
-        </w:rPr>
-        <w:t xml:space="preserve">&lt;モデル名&gt;</w:t>
-      </w:r>
-      <w:r>
-        <w:rPr>
-          <w:rFonts w:hint="eastAsia" w:ascii="Yu Gothic" w:hAnsi="Yu Gothic" w:eastAsia="Yu Gothic"/>
-        </w:rPr>
-        <w:t xml:space="preserve">を引数リスト形式で実行する。</w:t>
-      </w:r>
-    </w:p>
-    <w:p>
-      <w:pPr>
-        <w:pStyle w:val="Compact"/>
-        <w:numPr>
-          <w:ilvl w:val="0"/>
-          <w:numId w:val="1006"/>
-        </w:numPr>
-      </w:pPr>
-      <w:r>
-        <w:rPr>
-          <w:rFonts w:hint="eastAsia" w:ascii="Yu Gothic" w:hAnsi="Yu Gothic" w:eastAsia="Yu Gothic"/>
-        </w:rPr>
-        <w:t xml:space="preserve">実行前に大容量通信・ディスク使用の可能性を表示し、確認を求める。</w:t>
-      </w:r>
-    </w:p>
-    <w:p>
-      <w:pPr>
-        <w:pStyle w:val="Compact"/>
-        <w:numPr>
-          <w:ilvl w:val="0"/>
-          <w:numId w:val="1006"/>
-        </w:numPr>
-      </w:pPr>
-      <w:r>
-        <w:rPr>
-          <w:rFonts w:hint="eastAsia" w:ascii="Yu Gothic" w:hAnsi="Yu Gothic" w:eastAsia="Yu Gothic"/>
-        </w:rPr>
-        <w:t xml:space="preserve">インストール中は進捗を表示し、中止操作を提供する。</w:t>
-      </w:r>
-    </w:p>
-    <w:p>
-      <w:pPr>
-        <w:pStyle w:val="Compact"/>
-        <w:numPr>
-          <w:ilvl w:val="0"/>
-          <w:numId w:val="1006"/>
-        </w:numPr>
-      </w:pPr>
-      <w:r>
-        <w:rPr>
-          <w:rStyle w:val="VerbatimChar"/>
-          <w:rFonts w:ascii="Yu Gothic" w:hAnsi="Yu Gothic" w:eastAsia="Yu Gothic"/>
-        </w:rPr>
-        <w:t xml:space="preserve">:cloud</w:t>
-      </w:r>
-      <w:r>
-        <w:rPr>
-          <w:rFonts w:ascii="Yu Gothic" w:hAnsi="Yu Gothic" w:eastAsia="Yu Gothic"/>
-        </w:rPr>
-        <w:t xml:space="preserve">または</w:t>
-      </w:r>
-      <w:r>
-        <w:rPr>
-          <w:rStyle w:val="VerbatimChar"/>
-          <w:rFonts w:ascii="Yu Gothic" w:hAnsi="Yu Gothic" w:eastAsia="Yu Gothic"/>
-        </w:rPr>
-        <w:t xml:space="preserve">-cloud</w:t>
-      </w:r>
-      <w:r>
-        <w:rPr>
-          <w:rFonts w:hint="eastAsia" w:ascii="Yu Gothic" w:hAnsi="Yu Gothic" w:eastAsia="Yu Gothic"/>
-        </w:rPr>
-        <w:t xml:space="preserve">で終わるモデルをCloudモデルとして表示する。</w:t>
-      </w:r>
-    </w:p>
-    <w:p>
-      <w:pPr>
-        <w:pStyle w:val="Compact"/>
-        <w:numPr>
-          <w:ilvl w:val="0"/>
-          <w:numId w:val="1006"/>
-        </w:numPr>
-      </w:pPr>
-      <w:r>
-        <w:rPr>
-          <w:rStyle w:val="VerbatimChar"/>
-          <w:rFonts w:ascii="Yu Gothic" w:hAnsi="Yu Gothic" w:eastAsia="Yu Gothic"/>
-        </w:rPr>
-        <w:t xml:space="preserve">gpt-oss:120b-cloud</w:t>
-      </w:r>
-      <w:r>
-        <w:rPr>
-          <w:rFonts w:hint="eastAsia" w:ascii="Yu Gothic" w:hAnsi="Yu Gothic" w:eastAsia="Yu Gothic"/>
-        </w:rPr>
-        <w:t xml:space="preserve">が未導入の場合、切り替えを実行せずモデル管理タブへ案内する。</w:t>
-      </w:r>
-    </w:p>
-    <w:bookmarkEnd w:id="21"/>
-    <w:bookmarkStart w:id="24" w:name="X99959376e6e3dcbd0153f7b54635a1691173390"/>
-    <w:p>
-      <w:pPr>
-        <w:pStyle w:val="Heading2"/>
-      </w:pPr>
-      <w:r>
-        <w:rPr>
-          <w:rFonts w:ascii="Yu Gothic" w:hAnsi="Yu Gothic" w:eastAsia="Yu Gothic"/>
-        </w:rPr>
-        <w:t xml:space="preserve">7. </w:t>
-      </w:r>
-      <w:r>
-        <w:rPr>
-          <w:rFonts w:hint="eastAsia" w:ascii="Yu Gothic" w:hAnsi="Yu Gothic" w:eastAsia="Yu Gothic"/>
-        </w:rPr>
-        <w:t xml:space="preserve">設定・データ</w:t>
-      </w:r>
-    </w:p>
-    <w:bookmarkStart w:id="22" w:name="X6fc1dd271e0ead28f263165d00afb7e694b48cb"/>
-    <w:p>
-      <w:pPr>
-        <w:pStyle w:val="Heading3"/>
-      </w:pPr>
-      <w:r>
-        <w:rPr>
-          <w:rFonts w:ascii="Yu Gothic" w:hAnsi="Yu Gothic" w:eastAsia="Yu Gothic"/>
-        </w:rPr>
-        <w:t xml:space="preserve">7.1 </w:t>
-      </w:r>
-      <w:r>
-        <w:rPr>
-          <w:rFonts w:hint="eastAsia" w:ascii="Yu Gothic" w:hAnsi="Yu Gothic" w:eastAsia="Yu Gothic"/>
-        </w:rPr>
-        <w:t xml:space="preserve">アプリ専用設定</w:t>
-      </w:r>
-    </w:p>
-    <w:p>
-      <w:pPr>
-        <w:pStyle w:val="FirstParagraph"/>
-      </w:pPr>
-      <w:r>
-        <w:rPr>
-          <w:rFonts w:hint="eastAsia" w:ascii="Yu Gothic" w:hAnsi="Yu Gothic" w:eastAsia="Yu Gothic"/>
-        </w:rPr>
-        <w:t xml:space="preserve">保存先:</w:t>
-      </w:r>
-    </w:p>
-    <w:p>
-      <w:pPr>
-        <w:pStyle w:val="SourceCode"/>
-        <w:ind w:left="227" w:right="227"/>
-      </w:pPr>
+          <w:rFonts w:hint="eastAsia" w:ascii="Menlo" w:hAnsi="Menlo" w:eastAsia="Menlo"/>
+          <w:sz w:val="18"/>
+        </w:rPr>
+        <w:t xml:space="preserve">&lt;選択したモデル&gt;</w:t>
+      </w:r>
       <w:r>
         <w:rPr>
           <w:rStyle w:val="VerbatimChar"/>
           <w:rFonts w:ascii="Menlo" w:hAnsi="Menlo" w:eastAsia="Menlo"/>
           <w:sz w:val="18"/>
         </w:rPr>
+        <w:t xml:space="preserve"> --yes</w:t>
+      </w:r>
+    </w:p>
+    <w:p>
+      <w:pPr>
+        <w:pStyle w:val="FirstParagraph"/>
+      </w:pPr>
+      <w:r>
+        <w:rPr>
+          <w:rFonts w:hint="eastAsia" w:ascii="Yu Gothic" w:hAnsi="Yu Gothic" w:eastAsia="Yu Gothic"/>
+        </w:rPr>
+        <w:t xml:space="preserve">モデル名はアプリ専用JSONから取得し、実行前に再検証する。</w:t>
+      </w:r>
+    </w:p>
+    <w:bookmarkEnd w:id="19"/>
+    <w:bookmarkStart w:id="20" w:name="X05e92e6c17181c94e1c97afae43e9a4134a9b9b"/>
+    <w:p>
+      <w:pPr>
+        <w:pStyle w:val="Heading3"/>
+      </w:pPr>
+      <w:r>
+        <w:rPr>
+          <w:rFonts w:ascii="Yu Gothic" w:hAnsi="Yu Gothic" w:eastAsia="Yu Gothic"/>
+        </w:rPr>
+        <w:t xml:space="preserve">5.3 </w:t>
+      </w:r>
+      <w:r>
+        <w:rPr>
+          <w:rFonts w:hint="eastAsia" w:ascii="Yu Gothic" w:hAnsi="Yu Gothic" w:eastAsia="Yu Gothic"/>
+        </w:rPr>
+        <w:t xml:space="preserve">起動前処理</w:t>
+      </w:r>
+    </w:p>
+    <w:p>
+      <w:pPr>
+        <w:pStyle w:val="Compact"/>
+        <w:numPr>
+          <w:ilvl w:val="0"/>
+          <w:numId w:val="1006"/>
+        </w:numPr>
+      </w:pPr>
+      <w:r>
+        <w:rPr>
+          <w:rFonts w:hint="eastAsia" w:ascii="Yu Gothic" w:hAnsi="Yu Gothic" w:eastAsia="Yu Gothic"/>
+        </w:rPr>
+        <w:t xml:space="preserve">Ollamaと選択モデルの準備状態を確認する。</w:t>
+      </w:r>
+    </w:p>
+    <w:p>
+      <w:pPr>
+        <w:pStyle w:val="Compact"/>
+        <w:numPr>
+          <w:ilvl w:val="0"/>
+          <w:numId w:val="1006"/>
+        </w:numPr>
+      </w:pPr>
+      <w:r>
+        <w:rPr>
+          <w:rFonts w:hint="eastAsia" w:ascii="Yu Gothic" w:hAnsi="Yu Gothic" w:eastAsia="Yu Gothic"/>
+        </w:rPr>
+        <w:t xml:space="preserve">未準備の場合は起動せず、モデル管理画面へ案内する。</w:t>
+      </w:r>
+    </w:p>
+    <w:p>
+      <w:pPr>
+        <w:pStyle w:val="Compact"/>
+        <w:numPr>
+          <w:ilvl w:val="0"/>
+          <w:numId w:val="1006"/>
+        </w:numPr>
+      </w:pPr>
+      <w:r>
+        <w:rPr>
+          <w:rFonts w:hint="eastAsia" w:ascii="Yu Gothic" w:hAnsi="Yu Gothic" w:eastAsia="Yu Gothic"/>
+        </w:rPr>
+        <w:t xml:space="preserve">ローカルモデルの場合は毎回警告する。</w:t>
+      </w:r>
+    </w:p>
+    <w:p>
+      <w:pPr>
+        <w:pStyle w:val="Compact"/>
+        <w:numPr>
+          <w:ilvl w:val="0"/>
+          <w:numId w:val="1006"/>
+        </w:numPr>
+      </w:pPr>
+      <w:r>
+        <w:rPr>
+          <w:rFonts w:hint="eastAsia" w:ascii="Yu Gothic" w:hAnsi="Yu Gothic" w:eastAsia="Yu Gothic"/>
+        </w:rPr>
+        <w:t xml:space="preserve">現在状態と選択先が同じ場合、設定変更せずCodex</w:t>
+      </w:r>
+      <w:r>
+        <w:rPr>
+          <w:rFonts w:ascii="Yu Gothic" w:hAnsi="Yu Gothic" w:eastAsia="Yu Gothic"/>
+        </w:rPr>
+        <w:t xml:space="preserve"> </w:t>
+      </w:r>
+      <w:r>
+        <w:rPr>
+          <w:rFonts w:hint="eastAsia" w:ascii="Yu Gothic" w:hAnsi="Yu Gothic" w:eastAsia="Yu Gothic"/>
+        </w:rPr>
+        <w:t xml:space="preserve">Appを起動する。</w:t>
+      </w:r>
+    </w:p>
+    <w:p>
+      <w:pPr>
+        <w:pStyle w:val="Compact"/>
+        <w:numPr>
+          <w:ilvl w:val="0"/>
+          <w:numId w:val="1006"/>
+        </w:numPr>
+      </w:pPr>
+      <w:r>
+        <w:rPr>
+          <w:rFonts w:hint="eastAsia" w:ascii="Yu Gothic" w:hAnsi="Yu Gothic" w:eastAsia="Yu Gothic"/>
+        </w:rPr>
+        <w:t xml:space="preserve">接続先が異なりCodex</w:t>
+      </w:r>
+      <w:r>
+        <w:rPr>
+          <w:rFonts w:ascii="Yu Gothic" w:hAnsi="Yu Gothic" w:eastAsia="Yu Gothic"/>
+        </w:rPr>
+        <w:t xml:space="preserve"> </w:t>
+      </w:r>
+      <w:r>
+        <w:rPr>
+          <w:rFonts w:hint="eastAsia" w:ascii="Yu Gothic" w:hAnsi="Yu Gothic" w:eastAsia="Yu Gothic"/>
+        </w:rPr>
+        <w:t xml:space="preserve">Appが起動中の場合、未送信内容が失われる可能性を警告する。</w:t>
+      </w:r>
+    </w:p>
+    <w:p>
+      <w:pPr>
+        <w:pStyle w:val="Compact"/>
+        <w:numPr>
+          <w:ilvl w:val="0"/>
+          <w:numId w:val="1006"/>
+        </w:numPr>
+      </w:pPr>
+      <w:r>
+        <w:rPr>
+          <w:rFonts w:hint="eastAsia" w:ascii="Yu Gothic" w:hAnsi="Yu Gothic" w:eastAsia="Yu Gothic"/>
+        </w:rPr>
+        <w:t xml:space="preserve">承認後、AppleScriptでCodex</w:t>
+      </w:r>
+      <w:r>
+        <w:rPr>
+          <w:rFonts w:ascii="Yu Gothic" w:hAnsi="Yu Gothic" w:eastAsia="Yu Gothic"/>
+        </w:rPr>
+        <w:t xml:space="preserve"> </w:t>
+      </w:r>
+      <w:r>
+        <w:rPr>
+          <w:rFonts w:hint="eastAsia" w:ascii="Yu Gothic" w:hAnsi="Yu Gothic" w:eastAsia="Yu Gothic"/>
+        </w:rPr>
+        <w:t xml:space="preserve">Appを通常終了する。</w:t>
+      </w:r>
+    </w:p>
+    <w:p>
+      <w:pPr>
+        <w:pStyle w:val="Compact"/>
+        <w:numPr>
+          <w:ilvl w:val="0"/>
+          <w:numId w:val="1006"/>
+        </w:numPr>
+      </w:pPr>
+      <w:r>
+        <w:rPr>
+          <w:rFonts w:hint="eastAsia" w:ascii="Yu Gothic" w:hAnsi="Yu Gothic" w:eastAsia="Yu Gothic"/>
+        </w:rPr>
+        <w:t xml:space="preserve">Ollama公式コマンドで切り替え、設定状態を確認してCodex</w:t>
+      </w:r>
+      <w:r>
+        <w:rPr>
+          <w:rFonts w:ascii="Yu Gothic" w:hAnsi="Yu Gothic" w:eastAsia="Yu Gothic"/>
+        </w:rPr>
+        <w:t xml:space="preserve"> </w:t>
+      </w:r>
+      <w:r>
+        <w:rPr>
+          <w:rFonts w:hint="eastAsia" w:ascii="Yu Gothic" w:hAnsi="Yu Gothic" w:eastAsia="Yu Gothic"/>
+        </w:rPr>
+        <w:t xml:space="preserve">Appを起動する。</w:t>
+      </w:r>
+    </w:p>
+    <w:bookmarkEnd w:id="20"/>
+    <w:bookmarkEnd w:id="21"/>
+    <w:bookmarkStart w:id="22" w:name="X5f970d00d09077f4ff19a42fc475c1269468d4e"/>
+    <w:p>
+      <w:pPr>
+        <w:pStyle w:val="Heading2"/>
+      </w:pPr>
+      <w:r>
+        <w:rPr>
+          <w:rFonts w:ascii="Yu Gothic" w:hAnsi="Yu Gothic" w:eastAsia="Yu Gothic"/>
+        </w:rPr>
+        <w:t xml:space="preserve">6. </w:t>
+      </w:r>
+      <w:r>
+        <w:rPr>
+          <w:rFonts w:hint="eastAsia" w:ascii="Yu Gothic" w:hAnsi="Yu Gothic" w:eastAsia="Yu Gothic"/>
+        </w:rPr>
+        <w:t xml:space="preserve">モデル管理仕様</w:t>
+      </w:r>
+    </w:p>
+    <w:p>
+      <w:pPr>
+        <w:pStyle w:val="Compact"/>
+        <w:numPr>
+          <w:ilvl w:val="0"/>
+          <w:numId w:val="1007"/>
+        </w:numPr>
+      </w:pPr>
+      <w:r>
+        <w:rPr>
+          <w:rFonts w:hint="eastAsia" w:ascii="Yu Gothic" w:hAnsi="Yu Gothic" w:eastAsia="Yu Gothic"/>
+        </w:rPr>
+        <w:t xml:space="preserve">モデル名は英数字と</w:t>
+      </w:r>
+      <w:r>
+        <w:rPr>
+          <w:rStyle w:val="VerbatimChar"/>
+          <w:rFonts w:ascii="Yu Gothic" w:hAnsi="Yu Gothic" w:eastAsia="Yu Gothic"/>
+        </w:rPr>
+        <w:t xml:space="preserve">. _ : / -</w:t>
+      </w:r>
+      <w:r>
+        <w:rPr>
+          <w:rFonts w:hint="eastAsia" w:ascii="Yu Gothic" w:hAnsi="Yu Gothic" w:eastAsia="Yu Gothic"/>
+        </w:rPr>
+        <w:t xml:space="preserve">のみ許可し、最大200文字とする。</w:t>
+      </w:r>
+    </w:p>
+    <w:p>
+      <w:pPr>
+        <w:pStyle w:val="Compact"/>
+        <w:numPr>
+          <w:ilvl w:val="0"/>
+          <w:numId w:val="1007"/>
+        </w:numPr>
+      </w:pPr>
+      <w:r>
+        <w:rPr>
+          <w:rStyle w:val="VerbatimChar"/>
+          <w:rFonts w:ascii="Yu Gothic" w:hAnsi="Yu Gothic" w:eastAsia="Yu Gothic"/>
+        </w:rPr>
+        <w:t xml:space="preserve">:cloud</w:t>
+      </w:r>
+      <w:r>
+        <w:rPr>
+          <w:rFonts w:ascii="Yu Gothic" w:hAnsi="Yu Gothic" w:eastAsia="Yu Gothic"/>
+        </w:rPr>
+        <w:t xml:space="preserve">または</w:t>
+      </w:r>
+      <w:r>
+        <w:rPr>
+          <w:rStyle w:val="VerbatimChar"/>
+          <w:rFonts w:ascii="Yu Gothic" w:hAnsi="Yu Gothic" w:eastAsia="Yu Gothic"/>
+        </w:rPr>
+        <w:t xml:space="preserve">-cloud</w:t>
+      </w:r>
+      <w:r>
+        <w:rPr>
+          <w:rFonts w:hint="eastAsia" w:ascii="Yu Gothic" w:hAnsi="Yu Gothic" w:eastAsia="Yu Gothic"/>
+        </w:rPr>
+        <w:t xml:space="preserve">で終わるモデルをCloudモデルとして分類する。</w:t>
+      </w:r>
+    </w:p>
+    <w:p>
+      <w:pPr>
+        <w:pStyle w:val="Compact"/>
+        <w:numPr>
+          <w:ilvl w:val="0"/>
+          <w:numId w:val="1007"/>
+        </w:numPr>
+      </w:pPr>
+      <w:r>
+        <w:rPr>
+          <w:rFonts w:hint="eastAsia" w:ascii="Yu Gothic" w:hAnsi="Yu Gothic" w:eastAsia="Yu Gothic"/>
+        </w:rPr>
+        <w:t xml:space="preserve">モデル一覧はCloudモデルを先に表示する。</w:t>
+      </w:r>
+    </w:p>
+    <w:p>
+      <w:pPr>
+        <w:pStyle w:val="Compact"/>
+        <w:numPr>
+          <w:ilvl w:val="0"/>
+          <w:numId w:val="1007"/>
+        </w:numPr>
+      </w:pPr>
+      <w:r>
+        <w:rPr>
+          <w:rFonts w:ascii="Yu Gothic" w:hAnsi="Yu Gothic" w:eastAsia="Yu Gothic"/>
+        </w:rPr>
+        <w:t xml:space="preserve">インストールは</w:t>
+      </w:r>
+      <w:r>
+        <w:rPr>
+          <w:rStyle w:val="VerbatimChar"/>
+          <w:rFonts w:ascii="Yu Gothic" w:hAnsi="Yu Gothic" w:eastAsia="Yu Gothic"/>
+        </w:rPr>
+        <w:t xml:space="preserve">ollama pull </w:t>
+      </w:r>
+      <w:r>
+        <w:rPr>
+          <w:rStyle w:val="VerbatimChar"/>
+          <w:rFonts w:hint="eastAsia" w:ascii="Yu Gothic" w:hAnsi="Yu Gothic" w:eastAsia="Yu Gothic"/>
+        </w:rPr>
+        <w:t xml:space="preserve">&lt;モデル名&gt;</w:t>
+      </w:r>
+      <w:r>
+        <w:rPr>
+          <w:rFonts w:hint="eastAsia" w:ascii="Yu Gothic" w:hAnsi="Yu Gothic" w:eastAsia="Yu Gothic"/>
+        </w:rPr>
+        <w:t xml:space="preserve">を引数リスト形式で実行する。</w:t>
+      </w:r>
+    </w:p>
+    <w:p>
+      <w:pPr>
+        <w:pStyle w:val="Compact"/>
+        <w:numPr>
+          <w:ilvl w:val="0"/>
+          <w:numId w:val="1007"/>
+        </w:numPr>
+      </w:pPr>
+      <w:r>
+        <w:rPr>
+          <w:rFonts w:hint="eastAsia" w:ascii="Yu Gothic" w:hAnsi="Yu Gothic" w:eastAsia="Yu Gothic"/>
+        </w:rPr>
+        <w:t xml:space="preserve">実行前に通信量・ディスク使用の可能性を表示し、確認を求める。</w:t>
+      </w:r>
+    </w:p>
+    <w:p>
+      <w:pPr>
+        <w:pStyle w:val="Compact"/>
+        <w:numPr>
+          <w:ilvl w:val="0"/>
+          <w:numId w:val="1007"/>
+        </w:numPr>
+      </w:pPr>
+      <w:r>
+        <w:rPr>
+          <w:rFonts w:hint="eastAsia" w:ascii="Yu Gothic" w:hAnsi="Yu Gothic" w:eastAsia="Yu Gothic"/>
+        </w:rPr>
+        <w:t xml:space="preserve">インストール中は進捗と中止操作を提供する。</w:t>
+      </w:r>
+    </w:p>
+    <w:bookmarkEnd w:id="22"/>
+    <w:bookmarkStart w:id="23" w:name="X99959376e6e3dcbd0153f7b54635a1691173390"/>
+    <w:p>
+      <w:pPr>
+        <w:pStyle w:val="Heading2"/>
+      </w:pPr>
+      <w:r>
+        <w:rPr>
+          <w:rFonts w:ascii="Yu Gothic" w:hAnsi="Yu Gothic" w:eastAsia="Yu Gothic"/>
+        </w:rPr>
+        <w:t xml:space="preserve">7. </w:t>
+      </w:r>
+      <w:r>
+        <w:rPr>
+          <w:rFonts w:hint="eastAsia" w:ascii="Yu Gothic" w:hAnsi="Yu Gothic" w:eastAsia="Yu Gothic"/>
+        </w:rPr>
+        <w:t xml:space="preserve">設定・データ</w:t>
+      </w:r>
+    </w:p>
+    <w:p>
+      <w:pPr>
+        <w:pStyle w:val="FirstParagraph"/>
+      </w:pPr>
+      <w:r>
+        <w:rPr>
+          <w:rFonts w:hint="eastAsia" w:ascii="Yu Gothic" w:hAnsi="Yu Gothic" w:eastAsia="Yu Gothic"/>
+        </w:rPr>
+        <w:t xml:space="preserve">アプリ専用設定:</w:t>
+      </w:r>
+    </w:p>
+    <w:p>
+      <w:pPr>
+        <w:pStyle w:val="SourceCode"/>
+        <w:ind w:left="227" w:right="227"/>
+      </w:pPr>
+      <w:r>
+        <w:rPr>
+          <w:rStyle w:val="VerbatimChar"/>
+          <w:rFonts w:ascii="Menlo" w:hAnsi="Menlo" w:eastAsia="Menlo"/>
+          <w:sz w:val="18"/>
+        </w:rPr>
         <w:t xml:space="preserve">~/Library/Application Support/CodexModelLauncher/settings.json</w:t>
       </w:r>
     </w:p>
@@ -1675,7 +1866,28 @@
         <w:pStyle w:val="Compact"/>
         <w:numPr>
           <w:ilvl w:val="0"/>
-          <w:numId w:val="1007"/>
+          <w:numId w:val="1008"/>
+        </w:numPr>
+      </w:pPr>
+      <w:r>
+        <w:rPr>
+          <w:rFonts w:ascii="Yu Gothic" w:hAnsi="Yu Gothic" w:eastAsia="Yu Gothic"/>
+        </w:rPr>
+        <w:t xml:space="preserve">Codex </w:t>
+      </w:r>
+      <w:r>
+        <w:rPr>
+          <w:rFonts w:hint="eastAsia" w:ascii="Yu Gothic" w:hAnsi="Yu Gothic" w:eastAsia="Yu Gothic"/>
+        </w:rPr>
+        <w:t xml:space="preserve">Appで使用する選択中のOllamaモデル名</w:t>
+      </w:r>
+    </w:p>
+    <w:p>
+      <w:pPr>
+        <w:pStyle w:val="Compact"/>
+        <w:numPr>
+          <w:ilvl w:val="0"/>
+          <w:numId w:val="1008"/>
         </w:numPr>
       </w:pPr>
       <w:r>
@@ -1690,7 +1902,7 @@
         <w:pStyle w:val="Compact"/>
         <w:numPr>
           <w:ilvl w:val="0"/>
-          <w:numId w:val="1007"/>
+          <w:numId w:val="1008"/>
         </w:numPr>
       </w:pPr>
       <w:r>
@@ -1700,31 +1912,23 @@
         <w:t xml:space="preserve">ウィンドウ位置・サイズ</w:t>
       </w:r>
     </w:p>
-    <w:bookmarkEnd w:id="22"/>
-    <w:bookmarkStart w:id="23" w:name="X13b1a69b0268c86486e702bee3b951c3a015928"/>
-    <w:p>
-      <w:pPr>
-        <w:pStyle w:val="Heading3"/>
-      </w:pPr>
-      <w:r>
-        <w:rPr>
-          <w:rFonts w:ascii="Yu Gothic" w:hAnsi="Yu Gothic" w:eastAsia="Yu Gothic"/>
-        </w:rPr>
-        <w:t xml:space="preserve">7.2 </w:t>
-      </w:r>
-      <w:r>
-        <w:rPr>
-          <w:rFonts w:hint="eastAsia" w:ascii="Yu Gothic" w:hAnsi="Yu Gothic" w:eastAsia="Yu Gothic"/>
-        </w:rPr>
-        <w:t xml:space="preserve">Codex設定</w:t>
-      </w:r>
-    </w:p>
-    <w:p>
-      <w:pPr>
-        <w:pStyle w:val="Compact"/>
-        <w:numPr>
-          <w:ilvl w:val="0"/>
-          <w:numId w:val="1008"/>
+    <w:p>
+      <w:pPr>
+        <w:pStyle w:val="FirstParagraph"/>
+      </w:pPr>
+      <w:r>
+        <w:rPr>
+          <w:rFonts w:hint="eastAsia" w:ascii="Yu Gothic" w:hAnsi="Yu Gothic" w:eastAsia="Yu Gothic"/>
+        </w:rPr>
+        <w:t xml:space="preserve">Codex設定:</w:t>
+      </w:r>
+    </w:p>
+    <w:p>
+      <w:pPr>
+        <w:pStyle w:val="Compact"/>
+        <w:numPr>
+          <w:ilvl w:val="0"/>
+          <w:numId w:val="1009"/>
         </w:numPr>
       </w:pPr>
       <w:r>
@@ -1752,7 +1956,7 @@
         <w:pStyle w:val="Compact"/>
         <w:numPr>
           <w:ilvl w:val="0"/>
-          <w:numId w:val="1008"/>
+          <w:numId w:val="1009"/>
         </w:numPr>
       </w:pPr>
       <w:r>
@@ -1767,32 +1971,221 @@
         <w:pStyle w:val="Compact"/>
         <w:numPr>
           <w:ilvl w:val="0"/>
-          <w:numId w:val="1008"/>
-        </w:numPr>
-      </w:pPr>
-      <w:r>
-        <w:rPr>
-          <w:rFonts w:hint="eastAsia" w:ascii="Yu Gothic" w:hAnsi="Yu Gothic" w:eastAsia="Yu Gothic"/>
-        </w:rPr>
-        <w:t xml:space="preserve">設定変更、バックアップ、復元はOllama公式の</w:t>
-      </w:r>
+          <w:numId w:val="1009"/>
+        </w:numPr>
+      </w:pPr>
+      <w:r>
+        <w:rPr>
+          <w:rFonts w:hint="eastAsia" w:ascii="Yu Gothic" w:hAnsi="Yu Gothic" w:eastAsia="Yu Gothic"/>
+        </w:rPr>
+        <w:t xml:space="preserve">変更、バックアップ、復元はOllama公式機能へ委譲する。</w:t>
+      </w:r>
+    </w:p>
+    <w:bookmarkEnd w:id="23"/>
+    <w:bookmarkStart w:id="24" w:name="Xe6ea1bb9b1e2597d67e70148336c49aa9632fc8"/>
+    <w:p>
+      <w:pPr>
+        <w:pStyle w:val="Heading2"/>
+      </w:pPr>
+      <w:r>
+        <w:rPr>
+          <w:rFonts w:ascii="Yu Gothic" w:hAnsi="Yu Gothic" w:eastAsia="Yu Gothic"/>
+        </w:rPr>
+        <w:t xml:space="preserve">8. </w:t>
+      </w:r>
+      <w:r>
+        <w:rPr>
+          <w:rFonts w:hint="eastAsia" w:ascii="Yu Gothic" w:hAnsi="Yu Gothic" w:eastAsia="Yu Gothic"/>
+        </w:rPr>
+        <w:t xml:space="preserve">安全・セキュリティ仕様</w:t>
+      </w:r>
+    </w:p>
+    <w:p>
+      <w:pPr>
+        <w:pStyle w:val="Compact"/>
+        <w:numPr>
+          <w:ilvl w:val="0"/>
+          <w:numId w:val="1010"/>
+        </w:numPr>
+      </w:pPr>
       <w:r>
         <w:rPr>
           <w:rStyle w:val="VerbatimChar"/>
           <w:rFonts w:ascii="Yu Gothic" w:hAnsi="Yu Gothic" w:eastAsia="Yu Gothic"/>
         </w:rPr>
-        <w:t xml:space="preserve">ollama launch codex-app</w:t>
-      </w:r>
-      <w:r>
-        <w:rPr>
-          <w:rFonts w:hint="eastAsia" w:ascii="Yu Gothic" w:hAnsi="Yu Gothic" w:eastAsia="Yu Gothic"/>
-        </w:rPr>
-        <w:t xml:space="preserve">へ委譲する。</w:t>
-      </w:r>
-    </w:p>
-    <w:bookmarkEnd w:id="23"/>
+        <w:t xml:space="preserve">shell=True</w:t>
+      </w:r>
+      <w:r>
+        <w:rPr>
+          <w:rFonts w:ascii="Yu Gothic" w:hAnsi="Yu Gothic" w:eastAsia="Yu Gothic"/>
+        </w:rPr>
+        <w:t xml:space="preserve">、</w:t>
+      </w:r>
+      <w:r>
+        <w:rPr>
+          <w:rStyle w:val="VerbatimChar"/>
+          <w:rFonts w:ascii="Yu Gothic" w:hAnsi="Yu Gothic" w:eastAsia="Yu Gothic"/>
+        </w:rPr>
+        <w:t xml:space="preserve">os.system</w:t>
+      </w:r>
+      <w:r>
+        <w:rPr>
+          <w:rFonts w:ascii="Yu Gothic" w:hAnsi="Yu Gothic" w:eastAsia="Yu Gothic"/>
+        </w:rPr>
+        <w:t xml:space="preserve">、</w:t>
+      </w:r>
+      <w:r>
+        <w:rPr>
+          <w:rStyle w:val="VerbatimChar"/>
+          <w:rFonts w:ascii="Yu Gothic" w:hAnsi="Yu Gothic" w:eastAsia="Yu Gothic"/>
+        </w:rPr>
+        <w:t xml:space="preserve">eval</w:t>
+      </w:r>
+      <w:r>
+        <w:rPr>
+          <w:rFonts w:ascii="Yu Gothic" w:hAnsi="Yu Gothic" w:eastAsia="Yu Gothic"/>
+        </w:rPr>
+        <w:t xml:space="preserve">、</w:t>
+      </w:r>
+      <w:r>
+        <w:rPr>
+          <w:rStyle w:val="VerbatimChar"/>
+          <w:rFonts w:ascii="Yu Gothic" w:hAnsi="Yu Gothic" w:eastAsia="Yu Gothic"/>
+        </w:rPr>
+        <w:t xml:space="preserve">exec</w:t>
+      </w:r>
+      <w:r>
+        <w:rPr>
+          <w:rFonts w:hint="eastAsia" w:ascii="Yu Gothic" w:hAnsi="Yu Gothic" w:eastAsia="Yu Gothic"/>
+        </w:rPr>
+        <w:t xml:space="preserve">を使用しない。</w:t>
+      </w:r>
+    </w:p>
+    <w:p>
+      <w:pPr>
+        <w:pStyle w:val="Compact"/>
+        <w:numPr>
+          <w:ilvl w:val="0"/>
+          <w:numId w:val="1010"/>
+        </w:numPr>
+      </w:pPr>
+      <w:r>
+        <w:rPr>
+          <w:rFonts w:hint="eastAsia" w:ascii="Yu Gothic" w:hAnsi="Yu Gothic" w:eastAsia="Yu Gothic"/>
+        </w:rPr>
+        <w:t xml:space="preserve">外部コマンドは固定実行ファイルと検証済み引数リストで起動する。</w:t>
+      </w:r>
+    </w:p>
+    <w:p>
+      <w:pPr>
+        <w:pStyle w:val="Compact"/>
+        <w:numPr>
+          <w:ilvl w:val="0"/>
+          <w:numId w:val="1010"/>
+        </w:numPr>
+      </w:pPr>
+      <w:r>
+        <w:rPr>
+          <w:rFonts w:hint="eastAsia" w:ascii="Yu Gothic" w:hAnsi="Yu Gothic" w:eastAsia="Yu Gothic"/>
+        </w:rPr>
+        <w:t xml:space="preserve">選択モデルと手入力モデルの危険文字を拒否する。</w:t>
+      </w:r>
+    </w:p>
+    <w:p>
+      <w:pPr>
+        <w:pStyle w:val="Compact"/>
+        <w:numPr>
+          <w:ilvl w:val="0"/>
+          <w:numId w:val="1010"/>
+        </w:numPr>
+      </w:pPr>
+      <w:r>
+        <w:rPr>
+          <w:rFonts w:hint="eastAsia" w:ascii="Yu Gothic" w:hAnsi="Yu Gothic" w:eastAsia="Yu Gothic"/>
+        </w:rPr>
+        <w:t xml:space="preserve">モデル選択だけではCodex</w:t>
+      </w:r>
+      <w:r>
+        <w:rPr>
+          <w:rFonts w:ascii="Yu Gothic" w:hAnsi="Yu Gothic" w:eastAsia="Yu Gothic"/>
+        </w:rPr>
+        <w:t xml:space="preserve"> </w:t>
+      </w:r>
+      <w:r>
+        <w:rPr>
+          <w:rFonts w:hint="eastAsia" w:ascii="Yu Gothic" w:hAnsi="Yu Gothic" w:eastAsia="Yu Gothic"/>
+        </w:rPr>
+        <w:t xml:space="preserve">AppやCodex設定を変更しない。</w:t>
+      </w:r>
+    </w:p>
+    <w:p>
+      <w:pPr>
+        <w:pStyle w:val="Compact"/>
+        <w:numPr>
+          <w:ilvl w:val="0"/>
+          <w:numId w:val="1010"/>
+        </w:numPr>
+      </w:pPr>
+      <w:r>
+        <w:rPr>
+          <w:rFonts w:hint="eastAsia" w:ascii="Yu Gothic" w:hAnsi="Yu Gothic" w:eastAsia="Yu Gothic"/>
+        </w:rPr>
+        <w:t xml:space="preserve">ローカルモデルは詳細設定へ分離し、選択時・起動時に警告する。</w:t>
+      </w:r>
+    </w:p>
+    <w:p>
+      <w:pPr>
+        <w:pStyle w:val="Compact"/>
+        <w:numPr>
+          <w:ilvl w:val="0"/>
+          <w:numId w:val="1010"/>
+        </w:numPr>
+      </w:pPr>
+      <w:r>
+        <w:rPr>
+          <w:rFonts w:ascii="Yu Gothic" w:hAnsi="Yu Gothic" w:eastAsia="Yu Gothic"/>
+        </w:rPr>
+        <w:t xml:space="preserve">Codex </w:t>
+      </w:r>
+      <w:r>
+        <w:rPr>
+          <w:rFonts w:hint="eastAsia" w:ascii="Yu Gothic" w:hAnsi="Yu Gothic" w:eastAsia="Yu Gothic"/>
+        </w:rPr>
+        <w:t xml:space="preserve">Appを終了する前に利用者へ警告する。</w:t>
+      </w:r>
+    </w:p>
+    <w:p>
+      <w:pPr>
+        <w:pStyle w:val="Compact"/>
+        <w:numPr>
+          <w:ilvl w:val="0"/>
+          <w:numId w:val="1010"/>
+        </w:numPr>
+      </w:pPr>
+      <w:r>
+        <w:rPr>
+          <w:rFonts w:hint="eastAsia" w:ascii="Yu Gothic" w:hAnsi="Yu Gothic" w:eastAsia="Yu Gothic"/>
+        </w:rPr>
+        <w:t xml:space="preserve">モデル削除、Ollama自動インストール、無確認の大容量ダウンロードを行わない。</w:t>
+      </w:r>
+    </w:p>
+    <w:p>
+      <w:pPr>
+        <w:pStyle w:val="Compact"/>
+        <w:numPr>
+          <w:ilvl w:val="0"/>
+          <w:numId w:val="1010"/>
+        </w:numPr>
+      </w:pPr>
+      <w:r>
+        <w:rPr>
+          <w:rFonts w:hint="eastAsia" w:ascii="Yu Gothic" w:hAnsi="Yu Gothic" w:eastAsia="Yu Gothic"/>
+        </w:rPr>
+        <w:t xml:space="preserve">APIキー、認証情報、プロンプト、Codexプロジェクト内容を収集・送信しない。</w:t>
+      </w:r>
+    </w:p>
     <w:bookmarkEnd w:id="24"/>
-    <w:bookmarkStart w:id="25" w:name="Xe6ea1bb9b1e2597d67e70148336c49aa9632fc8"/>
+    <w:bookmarkStart w:id="25" w:name="X493b26d19fc9ade002cc3f66ad2ed6ee31a85a6"/>
     <w:p>
       <w:pPr>
         <w:pStyle w:val="Heading2"/>
@@ -1801,189 +2194,265 @@
         <w:rPr>
           <w:rFonts w:ascii="Yu Gothic" w:hAnsi="Yu Gothic" w:eastAsia="Yu Gothic"/>
         </w:rPr>
-        <w:t xml:space="preserve">8. </w:t>
-      </w:r>
-      <w:r>
-        <w:rPr>
-          <w:rFonts w:hint="eastAsia" w:ascii="Yu Gothic" w:hAnsi="Yu Gothic" w:eastAsia="Yu Gothic"/>
-        </w:rPr>
-        <w:t xml:space="preserve">安全・セキュリティ仕様</w:t>
-      </w:r>
-    </w:p>
-    <w:p>
-      <w:pPr>
-        <w:pStyle w:val="Compact"/>
-        <w:numPr>
-          <w:ilvl w:val="0"/>
-          <w:numId w:val="1009"/>
-        </w:numPr>
-      </w:pPr>
+        <w:t xml:space="preserve">9. </w:t>
+      </w:r>
+      <w:r>
+        <w:rPr>
+          <w:rFonts w:hint="eastAsia" w:ascii="Yu Gothic" w:hAnsi="Yu Gothic" w:eastAsia="Yu Gothic"/>
+        </w:rPr>
+        <w:t xml:space="preserve">配布仕様</w:t>
+      </w:r>
+    </w:p>
+    <w:p>
+      <w:pPr>
+        <w:pStyle w:val="Compact"/>
+        <w:numPr>
+          <w:ilvl w:val="0"/>
+          <w:numId w:val="1011"/>
+        </w:numPr>
+      </w:pPr>
+      <w:r>
+        <w:rPr>
+          <w:rFonts w:ascii="Yu Gothic" w:hAnsi="Yu Gothic" w:eastAsia="Yu Gothic"/>
+        </w:rPr>
+        <w:t xml:space="preserve">PyInstaller windowedアプリとしてarm64 </w:t>
+      </w:r>
+      <w:r>
+        <w:rPr>
+          <w:rFonts w:hint="eastAsia" w:ascii="Yu Gothic" w:hAnsi="Yu Gothic" w:eastAsia="Yu Gothic"/>
+        </w:rPr>
+        <w:t xml:space="preserve">macOS向けにビルドする。</w:t>
+      </w:r>
+    </w:p>
+    <w:p>
+      <w:pPr>
+        <w:pStyle w:val="Compact"/>
+        <w:numPr>
+          <w:ilvl w:val="0"/>
+          <w:numId w:val="1011"/>
+        </w:numPr>
+      </w:pPr>
+      <w:r>
+        <w:rPr>
+          <w:rFonts w:hint="eastAsia" w:ascii="Yu Gothic" w:hAnsi="Yu Gothic" w:eastAsia="Yu Gothic"/>
+        </w:rPr>
+        <w:t xml:space="preserve">アプリ名:</w:t>
+      </w:r>
+      <w:r>
+        <w:rPr>
+          <w:rFonts w:ascii="Yu Gothic" w:hAnsi="Yu Gothic" w:eastAsia="Yu Gothic"/>
+        </w:rPr>
+        <w:t xml:space="preserve"> </w:t>
+      </w:r>
       <w:r>
         <w:rPr>
           <w:rStyle w:val="VerbatimChar"/>
           <w:rFonts w:ascii="Yu Gothic" w:hAnsi="Yu Gothic" w:eastAsia="Yu Gothic"/>
         </w:rPr>
-        <w:t xml:space="preserve">shell=True</w:t>
-      </w:r>
-      <w:r>
-        <w:rPr>
-          <w:rFonts w:ascii="Yu Gothic" w:hAnsi="Yu Gothic" w:eastAsia="Yu Gothic"/>
-        </w:rPr>
-        <w:t xml:space="preserve">、</w:t>
+        <w:t xml:space="preserve">Codex App </w:t>
       </w:r>
       <w:r>
         <w:rPr>
           <w:rStyle w:val="VerbatimChar"/>
-          <w:rFonts w:ascii="Yu Gothic" w:hAnsi="Yu Gothic" w:eastAsia="Yu Gothic"/>
-        </w:rPr>
-        <w:t xml:space="preserve">os.system</w:t>
-      </w:r>
-      <w:r>
-        <w:rPr>
-          <w:rFonts w:ascii="Yu Gothic" w:hAnsi="Yu Gothic" w:eastAsia="Yu Gothic"/>
-        </w:rPr>
-        <w:t xml:space="preserve">、</w:t>
+          <w:rFonts w:hint="eastAsia" w:ascii="Yu Gothic" w:hAnsi="Yu Gothic" w:eastAsia="Yu Gothic"/>
+        </w:rPr>
+        <w:t xml:space="preserve">かんたん切り替え.app</w:t>
+      </w:r>
+    </w:p>
+    <w:p>
+      <w:pPr>
+        <w:pStyle w:val="Compact"/>
+        <w:numPr>
+          <w:ilvl w:val="0"/>
+          <w:numId w:val="1011"/>
+        </w:numPr>
+      </w:pPr>
+      <w:r>
+        <w:rPr>
+          <w:rFonts w:hint="eastAsia" w:ascii="Yu Gothic" w:hAnsi="Yu Gothic" w:eastAsia="Yu Gothic"/>
+        </w:rPr>
+        <w:t xml:space="preserve">配布ZIP:</w:t>
+      </w:r>
+      <w:r>
+        <w:rPr>
+          <w:rFonts w:ascii="Yu Gothic" w:hAnsi="Yu Gothic" w:eastAsia="Yu Gothic"/>
+        </w:rPr>
+        <w:t xml:space="preserve"> </w:t>
       </w:r>
       <w:r>
         <w:rPr>
           <w:rStyle w:val="VerbatimChar"/>
           <w:rFonts w:ascii="Yu Gothic" w:hAnsi="Yu Gothic" w:eastAsia="Yu Gothic"/>
         </w:rPr>
-        <w:t xml:space="preserve">eval</w:t>
-      </w:r>
-      <w:r>
-        <w:rPr>
-          <w:rFonts w:ascii="Yu Gothic" w:hAnsi="Yu Gothic" w:eastAsia="Yu Gothic"/>
-        </w:rPr>
-        <w:t xml:space="preserve">、</w:t>
+        <w:t xml:space="preserve">Codex-App-Easy-Switcher-macOS.zip</w:t>
+      </w:r>
+    </w:p>
+    <w:p>
+      <w:pPr>
+        <w:pStyle w:val="Compact"/>
+        <w:numPr>
+          <w:ilvl w:val="0"/>
+          <w:numId w:val="1011"/>
+        </w:numPr>
+      </w:pPr>
+      <w:r>
+        <w:rPr>
+          <w:rFonts w:hint="eastAsia" w:ascii="Yu Gothic" w:hAnsi="Yu Gothic" w:eastAsia="Yu Gothic"/>
+        </w:rPr>
+        <w:t xml:space="preserve">専用アイコンを組み込む。</w:t>
+      </w:r>
+    </w:p>
+    <w:p>
+      <w:pPr>
+        <w:pStyle w:val="Compact"/>
+        <w:numPr>
+          <w:ilvl w:val="0"/>
+          <w:numId w:val="1011"/>
+        </w:numPr>
+      </w:pPr>
+      <w:r>
+        <w:rPr>
+          <w:rFonts w:hint="eastAsia" w:ascii="Yu Gothic" w:hAnsi="Yu Gothic" w:eastAsia="Yu Gothic"/>
+        </w:rPr>
+        <w:t xml:space="preserve">アドホック署名を行い、Apple公証は実施しない。</w:t>
+      </w:r>
+    </w:p>
+    <w:bookmarkEnd w:id="25"/>
+    <w:bookmarkStart w:id="26" w:name="Xc9856cca48812e8dfa058cc41ce43e049f1c578"/>
+    <w:p>
+      <w:pPr>
+        <w:pStyle w:val="Heading2"/>
+      </w:pPr>
+      <w:r>
+        <w:rPr>
+          <w:rFonts w:ascii="Yu Gothic" w:hAnsi="Yu Gothic" w:eastAsia="Yu Gothic"/>
+        </w:rPr>
+        <w:t xml:space="preserve">10. </w:t>
+      </w:r>
+      <w:r>
+        <w:rPr>
+          <w:rFonts w:hint="eastAsia" w:ascii="Yu Gothic" w:hAnsi="Yu Gothic" w:eastAsia="Yu Gothic"/>
+        </w:rPr>
+        <w:t xml:space="preserve">既知の制約</w:t>
+      </w:r>
+    </w:p>
+    <w:p>
+      <w:pPr>
+        <w:pStyle w:val="Compact"/>
+        <w:numPr>
+          <w:ilvl w:val="0"/>
+          <w:numId w:val="1012"/>
+        </w:numPr>
+      </w:pPr>
+      <w:r>
+        <w:rPr>
+          <w:rFonts w:hint="eastAsia" w:ascii="Yu Gothic" w:hAnsi="Yu Gothic" w:eastAsia="Yu Gothic"/>
+        </w:rPr>
+        <w:t xml:space="preserve">Ollama一覧に表示されても、そのモデルがCodexのツール実行・ファイル編集に対応する保証はない。</w:t>
+      </w:r>
+    </w:p>
+    <w:p>
+      <w:pPr>
+        <w:pStyle w:val="Compact"/>
+        <w:numPr>
+          <w:ilvl w:val="0"/>
+          <w:numId w:val="1012"/>
+        </w:numPr>
+      </w:pPr>
+      <w:r>
+        <w:rPr>
+          <w:rFonts w:hint="eastAsia" w:ascii="Yu Gothic" w:hAnsi="Yu Gothic" w:eastAsia="Yu Gothic"/>
+        </w:rPr>
+        <w:t xml:space="preserve">ローカルモデルは性能・メモリ・コンテキスト長により正常に動作しない場合がある。</w:t>
+      </w:r>
+    </w:p>
+    <w:p>
+      <w:pPr>
+        <w:pStyle w:val="Compact"/>
+        <w:numPr>
+          <w:ilvl w:val="0"/>
+          <w:numId w:val="1012"/>
+        </w:numPr>
+      </w:pPr>
+      <w:r>
+        <w:rPr>
+          <w:rFonts w:hint="eastAsia" w:ascii="Yu Gothic" w:hAnsi="Yu Gothic" w:eastAsia="Yu Gothic"/>
+        </w:rPr>
+        <w:t xml:space="preserve">Cloudモデル利用にはOllamaへのサインインとインターネット接続が必要。</w:t>
+      </w:r>
+    </w:p>
+    <w:p>
+      <w:pPr>
+        <w:pStyle w:val="Compact"/>
+        <w:numPr>
+          <w:ilvl w:val="0"/>
+          <w:numId w:val="1012"/>
+        </w:numPr>
+      </w:pPr>
+      <w:r>
+        <w:rPr>
+          <w:rFonts w:hint="eastAsia" w:ascii="Yu Gothic" w:hAnsi="Yu Gothic" w:eastAsia="Yu Gothic"/>
+        </w:rPr>
+        <w:t xml:space="preserve">接続切り替えではCodex</w:t>
+      </w:r>
+      <w:r>
+        <w:rPr>
+          <w:rFonts w:ascii="Yu Gothic" w:hAnsi="Yu Gothic" w:eastAsia="Yu Gothic"/>
+        </w:rPr>
+        <w:t xml:space="preserve"> </w:t>
+      </w:r>
+      <w:r>
+        <w:rPr>
+          <w:rFonts w:hint="eastAsia" w:ascii="Yu Gothic" w:hAnsi="Yu Gothic" w:eastAsia="Yu Gothic"/>
+        </w:rPr>
+        <w:t xml:space="preserve">Appが終了・再起動され、未送信内容が失われる可能性がある。</w:t>
+      </w:r>
+    </w:p>
+    <w:p>
+      <w:pPr>
+        <w:pStyle w:val="Compact"/>
+        <w:numPr>
+          <w:ilvl w:val="0"/>
+          <w:numId w:val="1012"/>
+        </w:numPr>
+      </w:pPr>
+      <w:r>
+        <w:rPr>
+          <w:rFonts w:hint="eastAsia" w:ascii="Yu Gothic" w:hAnsi="Yu Gothic" w:eastAsia="Yu Gothic"/>
+        </w:rPr>
+        <w:t xml:space="preserve">Ollama公式機能がCodex設定を書き換え、通常</w:t>
       </w:r>
       <w:r>
         <w:rPr>
           <w:rStyle w:val="VerbatimChar"/>
           <w:rFonts w:ascii="Yu Gothic" w:hAnsi="Yu Gothic" w:eastAsia="Yu Gothic"/>
         </w:rPr>
-        <w:t xml:space="preserve">exec</w:t>
-      </w:r>
-      <w:r>
-        <w:rPr>
-          <w:rFonts w:hint="eastAsia" w:ascii="Yu Gothic" w:hAnsi="Yu Gothic" w:eastAsia="Yu Gothic"/>
-        </w:rPr>
-        <w:t xml:space="preserve">を使用しない。</w:t>
-      </w:r>
-    </w:p>
-    <w:p>
-      <w:pPr>
-        <w:pStyle w:val="Compact"/>
-        <w:numPr>
-          <w:ilvl w:val="0"/>
-          <w:numId w:val="1009"/>
-        </w:numPr>
-      </w:pPr>
-      <w:r>
-        <w:rPr>
-          <w:rFonts w:hint="eastAsia" w:ascii="Yu Gothic" w:hAnsi="Yu Gothic" w:eastAsia="Yu Gothic"/>
-        </w:rPr>
-        <w:t xml:space="preserve">外部コマンドは固定の実行ファイルと検証済み引数のリストで起動する。</w:t>
-      </w:r>
-    </w:p>
-    <w:p>
-      <w:pPr>
-        <w:pStyle w:val="Compact"/>
-        <w:numPr>
-          <w:ilvl w:val="0"/>
-          <w:numId w:val="1009"/>
-        </w:numPr>
-      </w:pPr>
-      <w:r>
-        <w:rPr>
-          <w:rFonts w:hint="eastAsia" w:ascii="Yu Gothic" w:hAnsi="Yu Gothic" w:eastAsia="Yu Gothic"/>
-        </w:rPr>
-        <w:t xml:space="preserve">モデル名の危険文字を拒否する。</w:t>
-      </w:r>
-    </w:p>
-    <w:p>
-      <w:pPr>
-        <w:pStyle w:val="Compact"/>
-        <w:numPr>
-          <w:ilvl w:val="0"/>
-          <w:numId w:val="1009"/>
-        </w:numPr>
-      </w:pPr>
-      <w:r>
-        <w:rPr>
-          <w:rFonts w:hint="eastAsia" w:ascii="Yu Gothic" w:hAnsi="Yu Gothic" w:eastAsia="Yu Gothic"/>
-        </w:rPr>
-        <w:t xml:space="preserve">ターミナルを表示しない。</w:t>
-      </w:r>
-    </w:p>
-    <w:p>
-      <w:pPr>
-        <w:pStyle w:val="Compact"/>
-        <w:numPr>
-          <w:ilvl w:val="0"/>
-          <w:numId w:val="1009"/>
-        </w:numPr>
-      </w:pPr>
-      <w:r>
-        <w:rPr>
-          <w:rFonts w:ascii="Yu Gothic" w:hAnsi="Yu Gothic" w:eastAsia="Yu Gothic"/>
-        </w:rPr>
-        <w:t xml:space="preserve">Codex </w:t>
-      </w:r>
-      <w:r>
-        <w:rPr>
-          <w:rFonts w:hint="eastAsia" w:ascii="Yu Gothic" w:hAnsi="Yu Gothic" w:eastAsia="Yu Gothic"/>
-        </w:rPr>
-        <w:t xml:space="preserve">Appを終了する前に利用者へ警告する。</w:t>
-      </w:r>
-    </w:p>
-    <w:p>
-      <w:pPr>
-        <w:pStyle w:val="Compact"/>
-        <w:numPr>
-          <w:ilvl w:val="0"/>
-          <w:numId w:val="1009"/>
-        </w:numPr>
-      </w:pPr>
-      <w:r>
-        <w:rPr>
-          <w:rFonts w:hint="eastAsia" w:ascii="Yu Gothic" w:hAnsi="Yu Gothic" w:eastAsia="Yu Gothic"/>
-        </w:rPr>
-        <w:t xml:space="preserve">Ollama接続状態で終了するとき、復元・維持・キャンセルを選択できる。</w:t>
-      </w:r>
-    </w:p>
-    <w:p>
-      <w:pPr>
-        <w:pStyle w:val="Compact"/>
-        <w:numPr>
-          <w:ilvl w:val="0"/>
-          <w:numId w:val="1009"/>
-        </w:numPr>
-      </w:pPr>
-      <w:r>
-        <w:rPr>
-          <w:rFonts w:hint="eastAsia" w:ascii="Yu Gothic" w:hAnsi="Yu Gothic" w:eastAsia="Yu Gothic"/>
-        </w:rPr>
-        <w:t xml:space="preserve">モデルの削除、Ollamaの自動インストール、無確認の大容量ダウンロードを行わない。</w:t>
-      </w:r>
-    </w:p>
-    <w:p>
-      <w:pPr>
-        <w:pStyle w:val="Compact"/>
-        <w:numPr>
-          <w:ilvl w:val="0"/>
-          <w:numId w:val="1009"/>
-        </w:numPr>
-      </w:pPr>
-      <w:r>
-        <w:rPr>
-          <w:rFonts w:hint="eastAsia" w:ascii="Yu Gothic" w:hAnsi="Yu Gothic" w:eastAsia="Yu Gothic"/>
-        </w:rPr>
-        <w:t xml:space="preserve">APIキー、認証情報、プロンプト、Codexプロジェクト内容を収集・送信しない。</w:t>
-      </w:r>
-    </w:p>
-    <w:bookmarkEnd w:id="25"/>
-    <w:bookmarkStart w:id="26" w:name="X493b26d19fc9ade002cc3f66ad2ed6ee31a85a6"/>
+        <w:t xml:space="preserve">~/.ollama/backup/codex-app/</w:t>
+      </w:r>
+      <w:r>
+        <w:rPr>
+          <w:rFonts w:hint="eastAsia" w:ascii="Yu Gothic" w:hAnsi="Yu Gothic" w:eastAsia="Yu Gothic"/>
+        </w:rPr>
+        <w:t xml:space="preserve">へ保存する。</w:t>
+      </w:r>
+    </w:p>
+    <w:p>
+      <w:pPr>
+        <w:pStyle w:val="Compact"/>
+        <w:numPr>
+          <w:ilvl w:val="0"/>
+          <w:numId w:val="1012"/>
+        </w:numPr>
+      </w:pPr>
+      <w:r>
+        <w:rPr>
+          <w:rFonts w:hint="eastAsia" w:ascii="Yu Gothic" w:hAnsi="Yu Gothic" w:eastAsia="Yu Gothic"/>
+        </w:rPr>
+        <w:t xml:space="preserve">Apple公証がないため、初回起動時にmacOSの警告が表示される場合がある。</w:t>
+      </w:r>
+    </w:p>
+    <w:bookmarkEnd w:id="26"/>
+    <w:bookmarkStart w:id="27" w:name="X1f38857ac360a8d826ab1002030bf11b8b088db"/>
     <w:p>
       <w:pPr>
         <w:pStyle w:val="Heading2"/>
@@ -1992,49 +2461,86 @@
         <w:rPr>
           <w:rFonts w:ascii="Yu Gothic" w:hAnsi="Yu Gothic" w:eastAsia="Yu Gothic"/>
         </w:rPr>
-        <w:t xml:space="preserve">9. </w:t>
-      </w:r>
-      <w:r>
-        <w:rPr>
-          <w:rFonts w:hint="eastAsia" w:ascii="Yu Gothic" w:hAnsi="Yu Gothic" w:eastAsia="Yu Gothic"/>
-        </w:rPr>
-        <w:t xml:space="preserve">配布仕様</w:t>
-      </w:r>
-    </w:p>
-    <w:p>
-      <w:pPr>
-        <w:pStyle w:val="Compact"/>
-        <w:numPr>
-          <w:ilvl w:val="0"/>
-          <w:numId w:val="1010"/>
-        </w:numPr>
-      </w:pPr>
-      <w:r>
-        <w:rPr>
-          <w:rFonts w:ascii="Yu Gothic" w:hAnsi="Yu Gothic" w:eastAsia="Yu Gothic"/>
-        </w:rPr>
-        <w:t xml:space="preserve">PyInstallerのwindowedアプリとしてarm64 </w:t>
-      </w:r>
-      <w:r>
-        <w:rPr>
-          <w:rFonts w:hint="eastAsia" w:ascii="Yu Gothic" w:hAnsi="Yu Gothic" w:eastAsia="Yu Gothic"/>
-        </w:rPr>
-        <w:t xml:space="preserve">macOS向けにビルドする。</w:t>
-      </w:r>
-    </w:p>
-    <w:p>
-      <w:pPr>
-        <w:pStyle w:val="Compact"/>
-        <w:numPr>
-          <w:ilvl w:val="0"/>
-          <w:numId w:val="1010"/>
-        </w:numPr>
-      </w:pPr>
-      <w:r>
-        <w:rPr>
-          <w:rFonts w:hint="eastAsia" w:ascii="Yu Gothic" w:hAnsi="Yu Gothic" w:eastAsia="Yu Gothic"/>
-        </w:rPr>
-        <w:t xml:space="preserve">アプリ名:</w:t>
+        <w:t xml:space="preserve">11. </w:t>
+      </w:r>
+      <w:r>
+        <w:rPr>
+          <w:rFonts w:hint="eastAsia" w:ascii="Yu Gothic" w:hAnsi="Yu Gothic" w:eastAsia="Yu Gothic"/>
+        </w:rPr>
+        <w:t xml:space="preserve">受入基準</w:t>
+      </w:r>
+    </w:p>
+    <w:p>
+      <w:pPr>
+        <w:pStyle w:val="Compact"/>
+        <w:numPr>
+          <w:ilvl w:val="0"/>
+          <w:numId w:val="1013"/>
+        </w:numPr>
+      </w:pPr>
+      <w:r>
+        <w:rPr>
+          <w:rFonts w:hint="eastAsia" w:ascii="Yu Gothic" w:hAnsi="Yu Gothic" w:eastAsia="Yu Gothic"/>
+        </w:rPr>
+        <w:t xml:space="preserve">初期選択モデルが</w:t>
+      </w:r>
+      <w:r>
+        <w:rPr>
+          <w:rStyle w:val="VerbatimChar"/>
+          <w:rFonts w:ascii="Yu Gothic" w:hAnsi="Yu Gothic" w:eastAsia="Yu Gothic"/>
+        </w:rPr>
+        <w:t xml:space="preserve">gpt-oss:120b-cloud</w:t>
+      </w:r>
+      <w:r>
+        <w:rPr>
+          <w:rFonts w:ascii="Yu Gothic" w:hAnsi="Yu Gothic" w:eastAsia="Yu Gothic"/>
+        </w:rPr>
+        <w:t xml:space="preserve">である。</w:t>
+      </w:r>
+    </w:p>
+    <w:p>
+      <w:pPr>
+        <w:pStyle w:val="Compact"/>
+        <w:numPr>
+          <w:ilvl w:val="0"/>
+          <w:numId w:val="1013"/>
+        </w:numPr>
+      </w:pPr>
+      <w:r>
+        <w:rPr>
+          <w:rFonts w:hint="eastAsia" w:ascii="Yu Gothic" w:hAnsi="Yu Gothic" w:eastAsia="Yu Gothic"/>
+        </w:rPr>
+        <w:t xml:space="preserve">Cloudモデルがローカルモデルより先に表示される。</w:t>
+      </w:r>
+    </w:p>
+    <w:p>
+      <w:pPr>
+        <w:pStyle w:val="Compact"/>
+        <w:numPr>
+          <w:ilvl w:val="0"/>
+          <w:numId w:val="1013"/>
+        </w:numPr>
+      </w:pPr>
+      <w:r>
+        <w:rPr>
+          <w:rFonts w:hint="eastAsia" w:ascii="Yu Gothic" w:hAnsi="Yu Gothic" w:eastAsia="Yu Gothic"/>
+        </w:rPr>
+        <w:t xml:space="preserve">選択モデルがアプリ専用JSONへ保存される。</w:t>
+      </w:r>
+    </w:p>
+    <w:p>
+      <w:pPr>
+        <w:pStyle w:val="Compact"/>
+        <w:numPr>
+          <w:ilvl w:val="0"/>
+          <w:numId w:val="1013"/>
+        </w:numPr>
+      </w:pPr>
+      <w:r>
+        <w:rPr>
+          <w:rFonts w:hint="eastAsia" w:ascii="Yu Gothic" w:hAnsi="Yu Gothic" w:eastAsia="Yu Gothic"/>
+        </w:rPr>
+        <w:t xml:space="preserve">モデル変更だけではCodex</w:t>
       </w:r>
       <w:r>
         <w:rPr>
@@ -2044,365 +2550,88 @@
       </w:r>
       <w:r>
         <w:rPr>
-          <w:rStyle w:val="VerbatimChar"/>
-          <w:rFonts w:ascii="Yu Gothic" w:hAnsi="Yu Gothic" w:eastAsia="Yu Gothic"/>
-        </w:rPr>
-        <w:t xml:space="preserve">Codex App </w:t>
-      </w:r>
-      <w:r>
-        <w:rPr>
-          <w:rStyle w:val="VerbatimChar"/>
-          <w:rFonts w:hint="eastAsia" w:ascii="Yu Gothic" w:hAnsi="Yu Gothic" w:eastAsia="Yu Gothic"/>
-        </w:rPr>
-        <w:t xml:space="preserve">かんたん切り替え.app</w:t>
-      </w:r>
-    </w:p>
-    <w:p>
-      <w:pPr>
-        <w:pStyle w:val="Compact"/>
-        <w:numPr>
-          <w:ilvl w:val="0"/>
-          <w:numId w:val="1010"/>
-        </w:numPr>
-      </w:pPr>
-      <w:r>
-        <w:rPr>
-          <w:rFonts w:hint="eastAsia" w:ascii="Yu Gothic" w:hAnsi="Yu Gothic" w:eastAsia="Yu Gothic"/>
-        </w:rPr>
-        <w:t xml:space="preserve">配布ZIP:</w:t>
-      </w:r>
-      <w:r>
-        <w:rPr>
-          <w:rFonts w:ascii="Yu Gothic" w:hAnsi="Yu Gothic" w:eastAsia="Yu Gothic"/>
-        </w:rPr>
-        <w:t xml:space="preserve"> </w:t>
-      </w:r>
-      <w:r>
-        <w:rPr>
-          <w:rStyle w:val="VerbatimChar"/>
-          <w:rFonts w:ascii="Yu Gothic" w:hAnsi="Yu Gothic" w:eastAsia="Yu Gothic"/>
-        </w:rPr>
-        <w:t xml:space="preserve">Codex-App-Easy-Switcher-macOS.zip</w:t>
-      </w:r>
-    </w:p>
-    <w:p>
-      <w:pPr>
-        <w:pStyle w:val="Compact"/>
-        <w:numPr>
-          <w:ilvl w:val="0"/>
-          <w:numId w:val="1010"/>
-        </w:numPr>
-      </w:pPr>
-      <w:r>
-        <w:rPr>
-          <w:rFonts w:hint="eastAsia" w:ascii="Yu Gothic" w:hAnsi="Yu Gothic" w:eastAsia="Yu Gothic"/>
-        </w:rPr>
-        <w:t xml:space="preserve">専用アイコンを組み込む。</w:t>
-      </w:r>
-    </w:p>
-    <w:p>
-      <w:pPr>
-        <w:pStyle w:val="Compact"/>
-        <w:numPr>
-          <w:ilvl w:val="0"/>
-          <w:numId w:val="1010"/>
-        </w:numPr>
-      </w:pPr>
-      <w:r>
-        <w:rPr>
-          <w:rFonts w:hint="eastAsia" w:ascii="Yu Gothic" w:hAnsi="Yu Gothic" w:eastAsia="Yu Gothic"/>
-        </w:rPr>
-        <w:t xml:space="preserve">現在はアドホック署名であり、Apple公証は未実施。</w:t>
-      </w:r>
-    </w:p>
-    <w:bookmarkEnd w:id="26"/>
-    <w:bookmarkStart w:id="27" w:name="Xc9856cca48812e8dfa058cc41ce43e049f1c578"/>
-    <w:p>
-      <w:pPr>
-        <w:pStyle w:val="Heading2"/>
-      </w:pPr>
-      <w:r>
-        <w:rPr>
-          <w:rFonts w:ascii="Yu Gothic" w:hAnsi="Yu Gothic" w:eastAsia="Yu Gothic"/>
-        </w:rPr>
-        <w:t xml:space="preserve">10. </w:t>
-      </w:r>
-      <w:r>
-        <w:rPr>
-          <w:rFonts w:hint="eastAsia" w:ascii="Yu Gothic" w:hAnsi="Yu Gothic" w:eastAsia="Yu Gothic"/>
-        </w:rPr>
-        <w:t xml:space="preserve">既知の制約</w:t>
-      </w:r>
-    </w:p>
-    <w:p>
-      <w:pPr>
-        <w:pStyle w:val="Compact"/>
-        <w:numPr>
-          <w:ilvl w:val="0"/>
-          <w:numId w:val="1011"/>
-        </w:numPr>
-      </w:pPr>
-      <w:r>
-        <w:rPr>
-          <w:rFonts w:ascii="Yu Gothic" w:hAnsi="Yu Gothic" w:eastAsia="Yu Gothic"/>
-        </w:rPr>
-        <w:t xml:space="preserve">Codex </w:t>
-      </w:r>
-      <w:r>
-        <w:rPr>
-          <w:rFonts w:hint="eastAsia" w:ascii="Yu Gothic" w:hAnsi="Yu Gothic" w:eastAsia="Yu Gothic"/>
-        </w:rPr>
-        <w:t xml:space="preserve">Appの切り替えはCodex</w:t>
-      </w:r>
-      <w:r>
-        <w:rPr>
-          <w:rFonts w:ascii="Yu Gothic" w:hAnsi="Yu Gothic" w:eastAsia="Yu Gothic"/>
-        </w:rPr>
-        <w:t xml:space="preserve"> </w:t>
-      </w:r>
-      <w:r>
-        <w:rPr>
-          <w:rFonts w:hint="eastAsia" w:ascii="Yu Gothic" w:hAnsi="Yu Gothic" w:eastAsia="Yu Gothic"/>
-        </w:rPr>
-        <w:t xml:space="preserve">Appを終了・再起動するため、未送信内容が失われる可能性がある。</w:t>
-      </w:r>
-    </w:p>
-    <w:p>
-      <w:pPr>
-        <w:pStyle w:val="Compact"/>
-        <w:numPr>
-          <w:ilvl w:val="0"/>
-          <w:numId w:val="1011"/>
-        </w:numPr>
-      </w:pPr>
-      <w:r>
-        <w:rPr>
-          <w:rFonts w:hint="eastAsia" w:ascii="Yu Gothic" w:hAnsi="Yu Gothic" w:eastAsia="Yu Gothic"/>
-        </w:rPr>
-        <w:t xml:space="preserve">Ollama公式機能がCodex設定を書き換える。復元用バックアップは通常</w:t>
-      </w:r>
-      <w:r>
-        <w:rPr>
-          <w:rFonts w:ascii="Yu Gothic" w:hAnsi="Yu Gothic" w:eastAsia="Yu Gothic"/>
-        </w:rPr>
-        <w:t xml:space="preserve"> </w:t>
-      </w:r>
-      <w:r>
-        <w:rPr>
-          <w:rStyle w:val="VerbatimChar"/>
-          <w:rFonts w:ascii="Yu Gothic" w:hAnsi="Yu Gothic" w:eastAsia="Yu Gothic"/>
-        </w:rPr>
-        <w:t xml:space="preserve">~/.ollama/backup/codex-app/</w:t>
-      </w:r>
-      <w:r>
-        <w:rPr>
-          <w:rFonts w:hint="eastAsia" w:ascii="Yu Gothic" w:hAnsi="Yu Gothic" w:eastAsia="Yu Gothic"/>
-        </w:rPr>
-        <w:t xml:space="preserve">に作成される。</w:t>
-      </w:r>
-    </w:p>
-    <w:p>
-      <w:pPr>
-        <w:pStyle w:val="Compact"/>
-        <w:numPr>
-          <w:ilvl w:val="0"/>
-          <w:numId w:val="1011"/>
-        </w:numPr>
-      </w:pPr>
-      <w:r>
-        <w:rPr>
-          <w:rFonts w:hint="eastAsia" w:ascii="Yu Gothic" w:hAnsi="Yu Gothic" w:eastAsia="Yu Gothic"/>
-        </w:rPr>
-        <w:t xml:space="preserve">Apple公証がないため、初回起動時にmacOSの警告が表示される場合がある。</w:t>
-      </w:r>
-    </w:p>
-    <w:p>
-      <w:pPr>
-        <w:pStyle w:val="Compact"/>
-        <w:numPr>
-          <w:ilvl w:val="0"/>
-          <w:numId w:val="1011"/>
-        </w:numPr>
-      </w:pPr>
-      <w:r>
-        <w:rPr>
-          <w:rFonts w:ascii="Yu Gothic" w:hAnsi="Yu Gothic" w:eastAsia="Yu Gothic"/>
-        </w:rPr>
-        <w:t xml:space="preserve">OllamaおよびCodex </w:t>
-      </w:r>
-      <w:r>
-        <w:rPr>
-          <w:rFonts w:hint="eastAsia" w:ascii="Yu Gothic" w:hAnsi="Yu Gothic" w:eastAsia="Yu Gothic"/>
-        </w:rPr>
-        <w:t xml:space="preserve">Appの将来の仕様変更により、連携方法が変わる可能性がある。</w:t>
+          <w:rFonts w:hint="eastAsia" w:ascii="Yu Gothic" w:hAnsi="Yu Gothic" w:eastAsia="Yu Gothic"/>
+        </w:rPr>
+        <w:t xml:space="preserve">Appを終了・再起動しない。</w:t>
+      </w:r>
+    </w:p>
+    <w:p>
+      <w:pPr>
+        <w:pStyle w:val="Compact"/>
+        <w:numPr>
+          <w:ilvl w:val="0"/>
+          <w:numId w:val="1013"/>
+        </w:numPr>
+      </w:pPr>
+      <w:r>
+        <w:rPr>
+          <w:rFonts w:hint="eastAsia" w:ascii="Yu Gothic" w:hAnsi="Yu Gothic" w:eastAsia="Yu Gothic"/>
+        </w:rPr>
+        <w:t xml:space="preserve">任意の検証済みモデル名を切り替え引数へ安全に設定できる。</w:t>
+      </w:r>
+    </w:p>
+    <w:p>
+      <w:pPr>
+        <w:pStyle w:val="Compact"/>
+        <w:numPr>
+          <w:ilvl w:val="0"/>
+          <w:numId w:val="1013"/>
+        </w:numPr>
+      </w:pPr>
+      <w:r>
+        <w:rPr>
+          <w:rFonts w:hint="eastAsia" w:ascii="Yu Gothic" w:hAnsi="Yu Gothic" w:eastAsia="Yu Gothic"/>
+        </w:rPr>
+        <w:t xml:space="preserve">未準備モデルは起動せずモデル管理画面へ案内する。</w:t>
+      </w:r>
+    </w:p>
+    <w:p>
+      <w:pPr>
+        <w:pStyle w:val="Compact"/>
+        <w:numPr>
+          <w:ilvl w:val="0"/>
+          <w:numId w:val="1013"/>
+        </w:numPr>
+      </w:pPr>
+      <w:r>
+        <w:rPr>
+          <w:rFonts w:hint="eastAsia" w:ascii="Yu Gothic" w:hAnsi="Yu Gothic" w:eastAsia="Yu Gothic"/>
+        </w:rPr>
+        <w:t xml:space="preserve">ローカルモデル選択時・起動時に警告する。</w:t>
+      </w:r>
+    </w:p>
+    <w:p>
+      <w:pPr>
+        <w:pStyle w:val="Compact"/>
+        <w:numPr>
+          <w:ilvl w:val="0"/>
+          <w:numId w:val="1013"/>
+        </w:numPr>
+      </w:pPr>
+      <w:r>
+        <w:rPr>
+          <w:rFonts w:hint="eastAsia" w:ascii="Yu Gothic" w:hAnsi="Yu Gothic" w:eastAsia="Yu Gothic"/>
+        </w:rPr>
+        <w:t xml:space="preserve">推奨モデルへボタンで戻せる。</w:t>
+      </w:r>
+    </w:p>
+    <w:p>
+      <w:pPr>
+        <w:pStyle w:val="Compact"/>
+        <w:numPr>
+          <w:ilvl w:val="0"/>
+          <w:numId w:val="1013"/>
+        </w:numPr>
+      </w:pPr>
+      <w:r>
+        <w:rPr>
+          <w:rFonts w:hint="eastAsia" w:ascii="Yu Gothic" w:hAnsi="Yu Gothic" w:eastAsia="Yu Gothic"/>
+        </w:rPr>
+        <w:t xml:space="preserve">自動テストがすべて成功する。</w:t>
       </w:r>
     </w:p>
     <w:bookmarkEnd w:id="27"/>
-    <w:bookmarkStart w:id="28" w:name="X1f38857ac360a8d826ab1002030bf11b8b088db"/>
-    <w:p>
-      <w:pPr>
-        <w:pStyle w:val="Heading2"/>
-      </w:pPr>
-      <w:r>
-        <w:rPr>
-          <w:rFonts w:ascii="Yu Gothic" w:hAnsi="Yu Gothic" w:eastAsia="Yu Gothic"/>
-        </w:rPr>
-        <w:t xml:space="preserve">11. </w:t>
-      </w:r>
-      <w:r>
-        <w:rPr>
-          <w:rFonts w:hint="eastAsia" w:ascii="Yu Gothic" w:hAnsi="Yu Gothic" w:eastAsia="Yu Gothic"/>
-        </w:rPr>
-        <w:t xml:space="preserve">受入基準</w:t>
-      </w:r>
-    </w:p>
-    <w:p>
-      <w:pPr>
-        <w:pStyle w:val="Compact"/>
-        <w:numPr>
-          <w:ilvl w:val="0"/>
-          <w:numId w:val="1012"/>
-        </w:numPr>
-      </w:pPr>
-      <w:r>
-        <w:rPr>
-          <w:rFonts w:hint="eastAsia" w:ascii="Yu Gothic" w:hAnsi="Yu Gothic" w:eastAsia="Yu Gothic"/>
-        </w:rPr>
-        <w:t xml:space="preserve">ターミナルを表示せずアプリを起動できる。</w:t>
-      </w:r>
-    </w:p>
-    <w:p>
-      <w:pPr>
-        <w:pStyle w:val="Compact"/>
-        <w:numPr>
-          <w:ilvl w:val="0"/>
-          <w:numId w:val="1012"/>
-        </w:numPr>
-      </w:pPr>
-      <w:r>
-        <w:rPr>
-          <w:rFonts w:hint="eastAsia" w:ascii="Yu Gothic" w:hAnsi="Yu Gothic" w:eastAsia="Yu Gothic"/>
-        </w:rPr>
-        <w:t xml:space="preserve">通常Codexと</w:t>
-      </w:r>
-      <w:r>
-        <w:rPr>
-          <w:rStyle w:val="VerbatimChar"/>
-          <w:rFonts w:ascii="Yu Gothic" w:hAnsi="Yu Gothic" w:eastAsia="Yu Gothic"/>
-        </w:rPr>
-        <w:t xml:space="preserve">gpt-oss:120b-cloud</w:t>
-      </w:r>
-      <w:r>
-        <w:rPr>
-          <w:rFonts w:hint="eastAsia" w:ascii="Yu Gothic" w:hAnsi="Yu Gothic" w:eastAsia="Yu Gothic"/>
-        </w:rPr>
-        <w:t xml:space="preserve">の切り替え引数が正しい。</w:t>
-      </w:r>
-    </w:p>
-    <w:p>
-      <w:pPr>
-        <w:pStyle w:val="Compact"/>
-        <w:numPr>
-          <w:ilvl w:val="0"/>
-          <w:numId w:val="1012"/>
-        </w:numPr>
-      </w:pPr>
-      <w:r>
-        <w:rPr>
-          <w:rFonts w:hint="eastAsia" w:ascii="Yu Gothic" w:hAnsi="Yu Gothic" w:eastAsia="Yu Gothic"/>
-        </w:rPr>
-        <w:t xml:space="preserve">同じ接続先では不要な切り替えを実行しない。</w:t>
-      </w:r>
-    </w:p>
-    <w:p>
-      <w:pPr>
-        <w:pStyle w:val="Compact"/>
-        <w:numPr>
-          <w:ilvl w:val="0"/>
-          <w:numId w:val="1012"/>
-        </w:numPr>
-      </w:pPr>
-      <w:r>
-        <w:rPr>
-          <w:rFonts w:hint="eastAsia" w:ascii="Yu Gothic" w:hAnsi="Yu Gothic" w:eastAsia="Yu Gothic"/>
-        </w:rPr>
-        <w:t xml:space="preserve">Ollamaモデル一覧をCloud</w:t>
-      </w:r>
-      <w:r>
-        <w:rPr>
-          <w:rFonts w:ascii="Yu Gothic" w:hAnsi="Yu Gothic" w:eastAsia="Yu Gothic"/>
-        </w:rPr>
-        <w:t xml:space="preserve"> / </w:t>
-      </w:r>
-      <w:r>
-        <w:rPr>
-          <w:rFonts w:hint="eastAsia" w:ascii="Yu Gothic" w:hAnsi="Yu Gothic" w:eastAsia="Yu Gothic"/>
-        </w:rPr>
-        <w:t xml:space="preserve">ローカルに分類できる。</w:t>
-      </w:r>
-    </w:p>
-    <w:p>
-      <w:pPr>
-        <w:pStyle w:val="Compact"/>
-        <w:numPr>
-          <w:ilvl w:val="0"/>
-          <w:numId w:val="1012"/>
-        </w:numPr>
-      </w:pPr>
-      <w:r>
-        <w:rPr>
-          <w:rFonts w:hint="eastAsia" w:ascii="Yu Gothic" w:hAnsi="Yu Gothic" w:eastAsia="Yu Gothic"/>
-        </w:rPr>
-        <w:t xml:space="preserve">危険なモデル名を拒否できる。</w:t>
-      </w:r>
-    </w:p>
-    <w:p>
-      <w:pPr>
-        <w:pStyle w:val="Compact"/>
-        <w:numPr>
-          <w:ilvl w:val="0"/>
-          <w:numId w:val="1012"/>
-        </w:numPr>
-      </w:pPr>
-      <w:r>
-        <w:rPr>
-          <w:rFonts w:hint="eastAsia" w:ascii="Yu Gothic" w:hAnsi="Yu Gothic" w:eastAsia="Yu Gothic"/>
-        </w:rPr>
-        <w:t xml:space="preserve">モデルインストールを確認後に開始し、中止できる。</w:t>
-      </w:r>
-    </w:p>
-    <w:p>
-      <w:pPr>
-        <w:pStyle w:val="Compact"/>
-        <w:numPr>
-          <w:ilvl w:val="0"/>
-          <w:numId w:val="1012"/>
-        </w:numPr>
-      </w:pPr>
-      <w:r>
-        <w:rPr>
-          <w:rFonts w:hint="eastAsia" w:ascii="Yu Gothic" w:hAnsi="Yu Gothic" w:eastAsia="Yu Gothic"/>
-        </w:rPr>
-        <w:t xml:space="preserve">Ollama状態で終了すると復元確認が表示される。</w:t>
-      </w:r>
-    </w:p>
-    <w:p>
-      <w:pPr>
-        <w:pStyle w:val="Compact"/>
-        <w:numPr>
-          <w:ilvl w:val="0"/>
-          <w:numId w:val="1012"/>
-        </w:numPr>
-      </w:pPr>
-      <w:r>
-        <w:rPr>
-          <w:rFonts w:hint="eastAsia" w:ascii="Yu Gothic" w:hAnsi="Yu Gothic" w:eastAsia="Yu Gothic"/>
-        </w:rPr>
-        <w:t xml:space="preserve">自動テストがすべて成功する。</w:t>
-      </w:r>
-    </w:p>
     <w:bookmarkEnd w:id="28"/>
-    <w:bookmarkEnd w:id="29"/>
     <w:sectPr>
       <w:footerReference w:type="default" r:id="rId10"/>
       <w:footnotePr>
@@ -2736,9 +2965,6 @@
     <w:abstractNumId w:val="991"/>
   </w:num>
   <w:num w:numId="1004">
-    <w:abstractNumId w:val="991"/>
-  </w:num>
-  <w:num w:numId="1005">
     <w:abstractNumId w:val="99411"/>
     <w:lvlOverride w:ilvl="0">
       <w:startOverride w:val="1"/>
@@ -2768,8 +2994,38 @@
       <w:startOverride w:val="1"/>
     </w:lvlOverride>
   </w:num>
+  <w:num w:numId="1005">
+    <w:abstractNumId w:val="991"/>
+  </w:num>
   <w:num w:numId="1006">
-    <w:abstractNumId w:val="991"/>
+    <w:abstractNumId w:val="99411"/>
+    <w:lvlOverride w:ilvl="0">
+      <w:startOverride w:val="1"/>
+    </w:lvlOverride>
+    <w:lvlOverride w:ilvl="1">
+      <w:startOverride w:val="1"/>
+    </w:lvlOverride>
+    <w:lvlOverride w:ilvl="2">
+      <w:startOverride w:val="1"/>
+    </w:lvlOverride>
+    <w:lvlOverride w:ilvl="3">
+      <w:startOverride w:val="1"/>
+    </w:lvlOverride>
+    <w:lvlOverride w:ilvl="4">
+      <w:startOverride w:val="1"/>
+    </w:lvlOverride>
+    <w:lvlOverride w:ilvl="5">
+      <w:startOverride w:val="1"/>
+    </w:lvlOverride>
+    <w:lvlOverride w:ilvl="6">
+      <w:startOverride w:val="1"/>
+    </w:lvlOverride>
+    <w:lvlOverride w:ilvl="7">
+      <w:startOverride w:val="1"/>
+    </w:lvlOverride>
+    <w:lvlOverride w:ilvl="8">
+      <w:startOverride w:val="1"/>
+    </w:lvlOverride>
   </w:num>
   <w:num w:numId="1007">
     <w:abstractNumId w:val="991"/>
@@ -2787,6 +3043,9 @@
     <w:abstractNumId w:val="991"/>
   </w:num>
   <w:num w:numId="1012">
+    <w:abstractNumId w:val="991"/>
+  </w:num>
+  <w:num w:numId="1013">
     <w:abstractNumId w:val="991"/>
   </w:num>
 </w:numbering>

</xml_diff>

<commit_message>
Add Windows EXE release workflow
</commit_message>
<xml_diff>
--- a/docs/Codex_App_かんたん切り替え_仕様書.docx
+++ b/docs/Codex_App_かんたん切り替え_仕様書.docx
@@ -2,7 +2,7 @@
 <file path=word/document.xml><?xml version="1.0" encoding="utf-8"?>
 <w:document xmlns:w="http://schemas.openxmlformats.org/wordprocessingml/2006/main" xmlns:m="http://schemas.openxmlformats.org/officeDocument/2006/math" xmlns:r="http://schemas.openxmlformats.org/officeDocument/2006/relationships" xmlns:o="urn:schemas-microsoft-com:office:office" xmlns:v="urn:schemas-microsoft-com:vml" xmlns:w10="urn:schemas-microsoft-com:office:word" xmlns:a="http://schemas.openxmlformats.org/drawingml/2006/main" xmlns:pic="http://schemas.openxmlformats.org/drawingml/2006/picture" xmlns:wp="http://schemas.openxmlformats.org/drawingml/2006/wordprocessingDrawing">
   <w:body>
-    <w:bookmarkStart w:id="28" w:name="codex-app-かんたん切り替え-仕様書"/>
+    <w:bookmarkStart w:id="29" w:name="codex-app-かんたん切り替え-仕様書"/>
     <w:p>
       <w:pPr>
         <w:jc w:val="center"/>
@@ -55,7 +55,7 @@
           <w:color w:val="5A6E78"/>
           <w:sz w:val="19"/>
         </w:rPr>
-        <w:t>バージョン 0.2.0  |  仕様書</w:t>
+        <w:t>バージョン 0.3.0  |  仕様書</w:t>
       </w:r>
     </w:p>
     <w:p>
@@ -291,7 +291,7 @@
                 <w:rFonts w:ascii="Yu Gothic" w:hAnsi="Yu Gothic" w:eastAsia="Yu Gothic"/>
                 <w:sz w:val="19"/>
               </w:rPr>
-              <w:t xml:space="preserve">0.2.0</w:t>
+              <w:t xml:space="preserve">0.3.0</w:t>
             </w:r>
           </w:p>
         </w:tc>
@@ -352,6 +352,34 @@
                 <w:sz w:val="19"/>
               </w:rPr>
               <w:t xml:space="preserve">12以降</w:t>
+            </w:r>
+            <w:r>
+              <w:rPr>
+                <w:rFonts w:ascii="Yu Gothic" w:hAnsi="Yu Gothic" w:eastAsia="Yu Gothic"/>
+                <w:sz w:val="19"/>
+              </w:rPr>
+              <w:t xml:space="preserve"> / </w:t>
+            </w:r>
+            <w:r>
+              <w:rPr>
+                <w:rFonts w:hint="eastAsia" w:ascii="Yu Gothic" w:hAnsi="Yu Gothic" w:eastAsia="Yu Gothic"/>
+                <w:sz w:val="19"/>
+              </w:rPr>
+              <w:t xml:space="preserve">Windows版Codex</w:t>
+            </w:r>
+            <w:r>
+              <w:rPr>
+                <w:rFonts w:ascii="Yu Gothic" w:hAnsi="Yu Gothic" w:eastAsia="Yu Gothic"/>
+                <w:sz w:val="19"/>
+              </w:rPr>
+              <w:t xml:space="preserve"> </w:t>
+            </w:r>
+            <w:r>
+              <w:rPr>
+                <w:rFonts w:hint="eastAsia" w:ascii="Yu Gothic" w:hAnsi="Yu Gothic" w:eastAsia="Yu Gothic"/>
+                <w:sz w:val="19"/>
+              </w:rPr>
+              <w:t xml:space="preserve">Appが動作するWindows</w:t>
             </w:r>
           </w:p>
         </w:tc>
@@ -890,7 +918,7 @@
         <w:rPr>
           <w:rFonts w:hint="eastAsia" w:ascii="Yu Gothic" w:hAnsi="Yu Gothic" w:eastAsia="Yu Gothic"/>
         </w:rPr>
-        <w:t xml:space="preserve">Windows対応・EXE配布</w:t>
+        <w:t xml:space="preserve">Ollama自体の自動インストール</w:t>
       </w:r>
     </w:p>
     <w:p>
@@ -905,7 +933,7 @@
         <w:rPr>
           <w:rFonts w:hint="eastAsia" w:ascii="Yu Gothic" w:hAnsi="Yu Gothic" w:eastAsia="Yu Gothic"/>
         </w:rPr>
-        <w:t xml:space="preserve">Ollama自体の自動インストール</w:t>
+        <w:t xml:space="preserve">Ollamaモデルの削除</w:t>
       </w:r>
     </w:p>
     <w:p>
@@ -920,7 +948,7 @@
         <w:rPr>
           <w:rFonts w:hint="eastAsia" w:ascii="Yu Gothic" w:hAnsi="Yu Gothic" w:eastAsia="Yu Gothic"/>
         </w:rPr>
-        <w:t xml:space="preserve">Ollamaモデルの削除</w:t>
+        <w:t xml:space="preserve">モデルごとのCodex互換性保証</w:t>
       </w:r>
     </w:p>
     <w:p>
@@ -933,9 +961,15 @@
       </w:pPr>
       <w:r>
         <w:rPr>
-          <w:rFonts w:hint="eastAsia" w:ascii="Yu Gothic" w:hAnsi="Yu Gothic" w:eastAsia="Yu Gothic"/>
-        </w:rPr>
-        <w:t xml:space="preserve">モデルごとのCodex互換性保証</w:t>
+          <w:rFonts w:ascii="Yu Gothic" w:hAnsi="Yu Gothic" w:eastAsia="Yu Gothic"/>
+        </w:rPr>
+        <w:t xml:space="preserve">Apple Developer </w:t>
+      </w:r>
+      <w:r>
+        <w:rPr>
+          <w:rFonts w:hint="eastAsia" w:ascii="Yu Gothic" w:hAnsi="Yu Gothic" w:eastAsia="Yu Gothic"/>
+        </w:rPr>
+        <w:t xml:space="preserve">ID署名・Apple公証</w:t>
       </w:r>
     </w:p>
     <w:p>
@@ -948,15 +982,9 @@
       </w:pPr>
       <w:r>
         <w:rPr>
-          <w:rFonts w:ascii="Yu Gothic" w:hAnsi="Yu Gothic" w:eastAsia="Yu Gothic"/>
-        </w:rPr>
-        <w:t xml:space="preserve">Apple Developer </w:t>
-      </w:r>
-      <w:r>
-        <w:rPr>
-          <w:rFonts w:hint="eastAsia" w:ascii="Yu Gothic" w:hAnsi="Yu Gothic" w:eastAsia="Yu Gothic"/>
-        </w:rPr>
-        <w:t xml:space="preserve">ID署名・Apple公証</w:t>
+          <w:rFonts w:hint="eastAsia" w:ascii="Yu Gothic" w:hAnsi="Yu Gothic" w:eastAsia="Yu Gothic"/>
+        </w:rPr>
+        <w:t xml:space="preserve">Windowsコード署名証明書による署名</w:t>
       </w:r>
     </w:p>
     <w:p>
@@ -1355,7 +1383,7 @@
     </w:p>
     <w:bookmarkEnd w:id="16"/>
     <w:bookmarkEnd w:id="17"/>
-    <w:bookmarkStart w:id="21" w:name="X126e3a2ac79ca71e34ae7724bb33ae78a6d44e8"/>
+    <w:bookmarkStart w:id="22" w:name="X126e3a2ac79ca71e34ae7724bb33ae78a6d44e8"/>
     <w:p>
       <w:pPr>
         <w:pStyle w:val="Heading2"/>
@@ -1601,7 +1629,7 @@
         <w:rPr>
           <w:rFonts w:hint="eastAsia" w:ascii="Yu Gothic" w:hAnsi="Yu Gothic" w:eastAsia="Yu Gothic"/>
         </w:rPr>
-        <w:t xml:space="preserve">承認後、AppleScriptでCodex</w:t>
+        <w:t xml:space="preserve">承認後、macOSではAppleScript、Windowsでは固定PowerShell処理でCodex</w:t>
       </w:r>
       <w:r>
         <w:rPr>
@@ -1613,7 +1641,19 @@
         <w:rPr>
           <w:rFonts w:hint="eastAsia" w:ascii="Yu Gothic" w:hAnsi="Yu Gothic" w:eastAsia="Yu Gothic"/>
         </w:rPr>
-        <w:t xml:space="preserve">Appを通常終了する。</w:t>
+        <w:t xml:space="preserve">Appへ通常終了を</w:t>
+      </w:r>
+      <w:r>
+        <w:rPr>
+          <w:rFonts w:ascii="Yu Gothic" w:hAnsi="Yu Gothic" w:eastAsia="Yu Gothic"/>
+        </w:rPr>
+        <w:t xml:space="preserve"> </w:t>
+      </w:r>
+      <w:r>
+        <w:rPr>
+          <w:rFonts w:hint="eastAsia" w:ascii="Yu Gothic" w:hAnsi="Yu Gothic" w:eastAsia="Yu Gothic"/>
+        </w:rPr>
+        <w:t xml:space="preserve">依頼する。強制終了は行わない。</w:t>
       </w:r>
     </w:p>
     <w:p>
@@ -1644,8 +1684,134 @@
       </w:r>
     </w:p>
     <w:bookmarkEnd w:id="20"/>
+    <w:bookmarkStart w:id="21" w:name="Xb185cc21c60922d9f43ddc5234bb506165e2388"/>
+    <w:p>
+      <w:pPr>
+        <w:pStyle w:val="Heading3"/>
+      </w:pPr>
+      <w:r>
+        <w:rPr>
+          <w:rFonts w:ascii="Yu Gothic" w:hAnsi="Yu Gothic" w:eastAsia="Yu Gothic"/>
+        </w:rPr>
+        <w:t xml:space="preserve">5.4 </w:t>
+      </w:r>
+      <w:r>
+        <w:rPr>
+          <w:rFonts w:hint="eastAsia" w:ascii="Yu Gothic" w:hAnsi="Yu Gothic" w:eastAsia="Yu Gothic"/>
+        </w:rPr>
+        <w:t xml:space="preserve">Windows固有処理</w:t>
+      </w:r>
+    </w:p>
+    <w:p>
+      <w:pPr>
+        <w:pStyle w:val="Compact"/>
+        <w:numPr>
+          <w:ilvl w:val="0"/>
+          <w:numId w:val="1007"/>
+        </w:numPr>
+      </w:pPr>
+      <w:r>
+        <w:rPr>
+          <w:rFonts w:ascii="Yu Gothic" w:hAnsi="Yu Gothic" w:eastAsia="Yu Gothic"/>
+        </w:rPr>
+        <w:t xml:space="preserve">Codex </w:t>
+      </w:r>
+      <w:r>
+        <w:rPr>
+          <w:rFonts w:hint="eastAsia" w:ascii="Yu Gothic" w:hAnsi="Yu Gothic" w:eastAsia="Yu Gothic"/>
+        </w:rPr>
+        <w:t xml:space="preserve">Appの存在確認と起動は、Windowsスタートメニューの登録情報を使用する。</w:t>
+      </w:r>
+    </w:p>
+    <w:p>
+      <w:pPr>
+        <w:pStyle w:val="Compact"/>
+        <w:numPr>
+          <w:ilvl w:val="0"/>
+          <w:numId w:val="1007"/>
+        </w:numPr>
+      </w:pPr>
+      <w:r>
+        <w:rPr>
+          <w:rFonts w:hint="eastAsia" w:ascii="Yu Gothic" w:hAnsi="Yu Gothic" w:eastAsia="Yu Gothic"/>
+        </w:rPr>
+        <w:t xml:space="preserve">起動状態確認は固定された</w:t>
+      </w:r>
+      <w:r>
+        <w:rPr>
+          <w:rStyle w:val="VerbatimChar"/>
+          <w:rFonts w:ascii="Yu Gothic" w:hAnsi="Yu Gothic" w:eastAsia="Yu Gothic"/>
+        </w:rPr>
+        <w:t xml:space="preserve">Get-Process</w:t>
+      </w:r>
+      <w:r>
+        <w:rPr>
+          <w:rFonts w:hint="eastAsia" w:ascii="Yu Gothic" w:hAnsi="Yu Gothic" w:eastAsia="Yu Gothic"/>
+        </w:rPr>
+        <w:t xml:space="preserve">処理を使用する。</w:t>
+      </w:r>
+    </w:p>
+    <w:p>
+      <w:pPr>
+        <w:pStyle w:val="Compact"/>
+        <w:numPr>
+          <w:ilvl w:val="0"/>
+          <w:numId w:val="1007"/>
+        </w:numPr>
+      </w:pPr>
+      <w:r>
+        <w:rPr>
+          <w:rFonts w:hint="eastAsia" w:ascii="Yu Gothic" w:hAnsi="Yu Gothic" w:eastAsia="Yu Gothic"/>
+        </w:rPr>
+        <w:t xml:space="preserve">通常終了は</w:t>
+      </w:r>
+      <w:r>
+        <w:rPr>
+          <w:rStyle w:val="VerbatimChar"/>
+          <w:rFonts w:ascii="Yu Gothic" w:hAnsi="Yu Gothic" w:eastAsia="Yu Gothic"/>
+        </w:rPr>
+        <w:t xml:space="preserve">CloseMainWindow()</w:t>
+      </w:r>
+      <w:r>
+        <w:rPr>
+          <w:rFonts w:hint="eastAsia" w:ascii="Yu Gothic" w:hAnsi="Yu Gothic" w:eastAsia="Yu Gothic"/>
+        </w:rPr>
+        <w:t xml:space="preserve">で依頼し、終了できない場合は手動終了を案内する。</w:t>
+      </w:r>
+    </w:p>
+    <w:p>
+      <w:pPr>
+        <w:pStyle w:val="Compact"/>
+        <w:numPr>
+          <w:ilvl w:val="0"/>
+          <w:numId w:val="1007"/>
+        </w:numPr>
+      </w:pPr>
+      <w:r>
+        <w:rPr>
+          <w:rFonts w:hint="eastAsia" w:ascii="Yu Gothic" w:hAnsi="Yu Gothic" w:eastAsia="Yu Gothic"/>
+        </w:rPr>
+        <w:t xml:space="preserve">ユーザー入力をPowerShellスクリプトへ埋め込まない。</w:t>
+      </w:r>
+    </w:p>
+    <w:p>
+      <w:pPr>
+        <w:pStyle w:val="Compact"/>
+        <w:numPr>
+          <w:ilvl w:val="0"/>
+          <w:numId w:val="1007"/>
+        </w:numPr>
+      </w:pPr>
+      <w:r>
+        <w:rPr>
+          <w:rFonts w:hint="eastAsia" w:ascii="Yu Gothic" w:hAnsi="Yu Gothic" w:eastAsia="Yu Gothic"/>
+        </w:rPr>
+        <w:t xml:space="preserve">Ollama・PowerShellなどの子プロセスはコマンド画面を表示せず起動する。</w:t>
+      </w:r>
+    </w:p>
     <w:bookmarkEnd w:id="21"/>
-    <w:bookmarkStart w:id="22" w:name="X5f970d00d09077f4ff19a42fc475c1269468d4e"/>
+    <w:bookmarkEnd w:id="22"/>
+    <w:bookmarkStart w:id="23" w:name="X5f970d00d09077f4ff19a42fc475c1269468d4e"/>
     <w:p>
       <w:pPr>
         <w:pStyle w:val="Heading2"/>
@@ -1668,7 +1834,7 @@
         <w:pStyle w:val="Compact"/>
         <w:numPr>
           <w:ilvl w:val="0"/>
-          <w:numId w:val="1007"/>
+          <w:numId w:val="1008"/>
         </w:numPr>
       </w:pPr>
       <w:r>
@@ -1696,7 +1862,7 @@
         <w:pStyle w:val="Compact"/>
         <w:numPr>
           <w:ilvl w:val="0"/>
-          <w:numId w:val="1007"/>
+          <w:numId w:val="1008"/>
         </w:numPr>
       </w:pPr>
       <w:r>
@@ -1731,7 +1897,7 @@
         <w:pStyle w:val="Compact"/>
         <w:numPr>
           <w:ilvl w:val="0"/>
-          <w:numId w:val="1007"/>
+          <w:numId w:val="1008"/>
         </w:numPr>
       </w:pPr>
       <w:r>
@@ -1746,7 +1912,7 @@
         <w:pStyle w:val="Compact"/>
         <w:numPr>
           <w:ilvl w:val="0"/>
-          <w:numId w:val="1007"/>
+          <w:numId w:val="1008"/>
         </w:numPr>
       </w:pPr>
       <w:r>
@@ -1781,7 +1947,7 @@
         <w:pStyle w:val="Compact"/>
         <w:numPr>
           <w:ilvl w:val="0"/>
-          <w:numId w:val="1007"/>
+          <w:numId w:val="1008"/>
         </w:numPr>
       </w:pPr>
       <w:r>
@@ -1796,7 +1962,7 @@
         <w:pStyle w:val="Compact"/>
         <w:numPr>
           <w:ilvl w:val="0"/>
-          <w:numId w:val="1007"/>
+          <w:numId w:val="1008"/>
         </w:numPr>
       </w:pPr>
       <w:r>
@@ -1806,8 +1972,8 @@
         <w:t xml:space="preserve">インストール中は進捗と中止操作を提供する。</w:t>
       </w:r>
     </w:p>
-    <w:bookmarkEnd w:id="22"/>
-    <w:bookmarkStart w:id="23" w:name="X99959376e6e3dcbd0153f7b54635a1691173390"/>
+    <w:bookmarkEnd w:id="23"/>
+    <w:bookmarkStart w:id="24" w:name="X99959376e6e3dcbd0153f7b54635a1691173390"/>
     <w:p>
       <w:pPr>
         <w:pStyle w:val="Heading2"/>
@@ -1847,7 +2013,22 @@
           <w:rFonts w:ascii="Menlo" w:hAnsi="Menlo" w:eastAsia="Menlo"/>
           <w:sz w:val="18"/>
         </w:rPr>
-        <w:t xml:space="preserve">~/Library/Application Support/CodexModelLauncher/settings.json</w:t>
+        <w:t xml:space="preserve">macOS: ~/Library/Application Support/CodexModelLauncher/settings.json</w:t>
+      </w:r>
+      <w:r>
+        <w:rPr>
+          <w:rFonts w:ascii="Menlo" w:hAnsi="Menlo" w:eastAsia="Menlo"/>
+          <w:sz w:val="18"/>
+        </w:rPr>
+        <w:br/>
+      </w:r>
+      <w:r>
+        <w:rPr>
+          <w:rStyle w:val="VerbatimChar"/>
+          <w:rFonts w:ascii="Menlo" w:hAnsi="Menlo" w:eastAsia="Menlo"/>
+          <w:sz w:val="18"/>
+        </w:rPr>
+        <w:t xml:space="preserve">Windows: %LOCALAPPDATA%\CodexModelLauncher\settings.json</w:t>
       </w:r>
     </w:p>
     <w:p>
@@ -1866,7 +2047,7 @@
         <w:pStyle w:val="Compact"/>
         <w:numPr>
           <w:ilvl w:val="0"/>
-          <w:numId w:val="1008"/>
+          <w:numId w:val="1009"/>
         </w:numPr>
       </w:pPr>
       <w:r>
@@ -1887,7 +2068,7 @@
         <w:pStyle w:val="Compact"/>
         <w:numPr>
           <w:ilvl w:val="0"/>
-          <w:numId w:val="1008"/>
+          <w:numId w:val="1009"/>
         </w:numPr>
       </w:pPr>
       <w:r>
@@ -1902,7 +2083,7 @@
         <w:pStyle w:val="Compact"/>
         <w:numPr>
           <w:ilvl w:val="0"/>
-          <w:numId w:val="1008"/>
+          <w:numId w:val="1009"/>
         </w:numPr>
       </w:pPr>
       <w:r>
@@ -1928,7 +2109,7 @@
         <w:pStyle w:val="Compact"/>
         <w:numPr>
           <w:ilvl w:val="0"/>
-          <w:numId w:val="1009"/>
+          <w:numId w:val="1010"/>
         </w:numPr>
       </w:pPr>
       <w:r>
@@ -1956,7 +2137,7 @@
         <w:pStyle w:val="Compact"/>
         <w:numPr>
           <w:ilvl w:val="0"/>
-          <w:numId w:val="1009"/>
+          <w:numId w:val="1010"/>
         </w:numPr>
       </w:pPr>
       <w:r>
@@ -1971,7 +2152,7 @@
         <w:pStyle w:val="Compact"/>
         <w:numPr>
           <w:ilvl w:val="0"/>
-          <w:numId w:val="1009"/>
+          <w:numId w:val="1010"/>
         </w:numPr>
       </w:pPr>
       <w:r>
@@ -1981,8 +2162,8 @@
         <w:t xml:space="preserve">変更、バックアップ、復元はOllama公式機能へ委譲する。</w:t>
       </w:r>
     </w:p>
-    <w:bookmarkEnd w:id="23"/>
-    <w:bookmarkStart w:id="24" w:name="Xe6ea1bb9b1e2597d67e70148336c49aa9632fc8"/>
+    <w:bookmarkEnd w:id="24"/>
+    <w:bookmarkStart w:id="25" w:name="Xe6ea1bb9b1e2597d67e70148336c49aa9632fc8"/>
     <w:p>
       <w:pPr>
         <w:pStyle w:val="Heading2"/>
@@ -2005,7 +2186,7 @@
         <w:pStyle w:val="Compact"/>
         <w:numPr>
           <w:ilvl w:val="0"/>
-          <w:numId w:val="1010"/>
+          <w:numId w:val="1011"/>
         </w:numPr>
       </w:pPr>
       <w:r>
@@ -2066,7 +2247,7 @@
         <w:pStyle w:val="Compact"/>
         <w:numPr>
           <w:ilvl w:val="0"/>
-          <w:numId w:val="1010"/>
+          <w:numId w:val="1011"/>
         </w:numPr>
       </w:pPr>
       <w:r>
@@ -2081,7 +2262,7 @@
         <w:pStyle w:val="Compact"/>
         <w:numPr>
           <w:ilvl w:val="0"/>
-          <w:numId w:val="1010"/>
+          <w:numId w:val="1011"/>
         </w:numPr>
       </w:pPr>
       <w:r>
@@ -2096,7 +2277,7 @@
         <w:pStyle w:val="Compact"/>
         <w:numPr>
           <w:ilvl w:val="0"/>
-          <w:numId w:val="1010"/>
+          <w:numId w:val="1011"/>
         </w:numPr>
       </w:pPr>
       <w:r>
@@ -2123,7 +2304,7 @@
         <w:pStyle w:val="Compact"/>
         <w:numPr>
           <w:ilvl w:val="0"/>
-          <w:numId w:val="1010"/>
+          <w:numId w:val="1011"/>
         </w:numPr>
       </w:pPr>
       <w:r>
@@ -2138,7 +2319,7 @@
         <w:pStyle w:val="Compact"/>
         <w:numPr>
           <w:ilvl w:val="0"/>
-          <w:numId w:val="1010"/>
+          <w:numId w:val="1011"/>
         </w:numPr>
       </w:pPr>
       <w:r>
@@ -2159,7 +2340,37 @@
         <w:pStyle w:val="Compact"/>
         <w:numPr>
           <w:ilvl w:val="0"/>
-          <w:numId w:val="1010"/>
+          <w:numId w:val="1011"/>
+        </w:numPr>
+      </w:pPr>
+      <w:r>
+        <w:rPr>
+          <w:rFonts w:hint="eastAsia" w:ascii="Yu Gothic" w:hAnsi="Yu Gothic" w:eastAsia="Yu Gothic"/>
+        </w:rPr>
+        <w:t xml:space="preserve">Windowsでは固定PowerShell処理のみ使用し、強制終了しない。</w:t>
+      </w:r>
+    </w:p>
+    <w:p>
+      <w:pPr>
+        <w:pStyle w:val="Compact"/>
+        <w:numPr>
+          <w:ilvl w:val="0"/>
+          <w:numId w:val="1011"/>
+        </w:numPr>
+      </w:pPr>
+      <w:r>
+        <w:rPr>
+          <w:rFonts w:hint="eastAsia" w:ascii="Yu Gothic" w:hAnsi="Yu Gothic" w:eastAsia="Yu Gothic"/>
+        </w:rPr>
+        <w:t xml:space="preserve">Windowsでは子プロセスのコマンド画面を表示しない。</w:t>
+      </w:r>
+    </w:p>
+    <w:p>
+      <w:pPr>
+        <w:pStyle w:val="Compact"/>
+        <w:numPr>
+          <w:ilvl w:val="0"/>
+          <w:numId w:val="1011"/>
         </w:numPr>
       </w:pPr>
       <w:r>
@@ -2174,7 +2385,7 @@
         <w:pStyle w:val="Compact"/>
         <w:numPr>
           <w:ilvl w:val="0"/>
-          <w:numId w:val="1010"/>
+          <w:numId w:val="1011"/>
         </w:numPr>
       </w:pPr>
       <w:r>
@@ -2184,8 +2395,8 @@
         <w:t xml:space="preserve">APIキー、認証情報、プロンプト、Codexプロジェクト内容を収集・送信しない。</w:t>
       </w:r>
     </w:p>
-    <w:bookmarkEnd w:id="24"/>
-    <w:bookmarkStart w:id="25" w:name="X493b26d19fc9ade002cc3f66ad2ed6ee31a85a6"/>
+    <w:bookmarkEnd w:id="25"/>
+    <w:bookmarkStart w:id="26" w:name="X493b26d19fc9ade002cc3f66ad2ed6ee31a85a6"/>
     <w:p>
       <w:pPr>
         <w:pStyle w:val="Heading2"/>
@@ -2208,35 +2419,35 @@
         <w:pStyle w:val="Compact"/>
         <w:numPr>
           <w:ilvl w:val="0"/>
-          <w:numId w:val="1011"/>
-        </w:numPr>
-      </w:pPr>
-      <w:r>
-        <w:rPr>
-          <w:rFonts w:ascii="Yu Gothic" w:hAnsi="Yu Gothic" w:eastAsia="Yu Gothic"/>
-        </w:rPr>
-        <w:t xml:space="preserve">PyInstaller windowedアプリとしてarm64 </w:t>
-      </w:r>
-      <w:r>
-        <w:rPr>
-          <w:rFonts w:hint="eastAsia" w:ascii="Yu Gothic" w:hAnsi="Yu Gothic" w:eastAsia="Yu Gothic"/>
-        </w:rPr>
-        <w:t xml:space="preserve">macOS向けにビルドする。</w:t>
-      </w:r>
-    </w:p>
-    <w:p>
-      <w:pPr>
-        <w:pStyle w:val="Compact"/>
-        <w:numPr>
-          <w:ilvl w:val="0"/>
-          <w:numId w:val="1011"/>
-        </w:numPr>
-      </w:pPr>
-      <w:r>
-        <w:rPr>
-          <w:rFonts w:hint="eastAsia" w:ascii="Yu Gothic" w:hAnsi="Yu Gothic" w:eastAsia="Yu Gothic"/>
-        </w:rPr>
-        <w:t xml:space="preserve">アプリ名:</w:t>
+          <w:numId w:val="1012"/>
+        </w:numPr>
+      </w:pPr>
+      <w:r>
+        <w:rPr>
+          <w:rFonts w:ascii="Yu Gothic" w:hAnsi="Yu Gothic" w:eastAsia="Yu Gothic"/>
+        </w:rPr>
+        <w:t xml:space="preserve">macOSはPyInstaller </w:t>
+      </w:r>
+      <w:r>
+        <w:rPr>
+          <w:rFonts w:hint="eastAsia" w:ascii="Yu Gothic" w:hAnsi="Yu Gothic" w:eastAsia="Yu Gothic"/>
+        </w:rPr>
+        <w:t xml:space="preserve">windowedアプリとしてarm64向けにビルドする。</w:t>
+      </w:r>
+    </w:p>
+    <w:p>
+      <w:pPr>
+        <w:pStyle w:val="Compact"/>
+        <w:numPr>
+          <w:ilvl w:val="0"/>
+          <w:numId w:val="1012"/>
+        </w:numPr>
+      </w:pPr>
+      <w:r>
+        <w:rPr>
+          <w:rFonts w:hint="eastAsia" w:ascii="Yu Gothic" w:hAnsi="Yu Gothic" w:eastAsia="Yu Gothic"/>
+        </w:rPr>
+        <w:t xml:space="preserve">macOSアプリ名:</w:t>
       </w:r>
       <w:r>
         <w:rPr>
@@ -2264,14 +2475,14 @@
         <w:pStyle w:val="Compact"/>
         <w:numPr>
           <w:ilvl w:val="0"/>
-          <w:numId w:val="1011"/>
-        </w:numPr>
-      </w:pPr>
-      <w:r>
-        <w:rPr>
-          <w:rFonts w:hint="eastAsia" w:ascii="Yu Gothic" w:hAnsi="Yu Gothic" w:eastAsia="Yu Gothic"/>
-        </w:rPr>
-        <w:t xml:space="preserve">配布ZIP:</w:t>
+          <w:numId w:val="1012"/>
+        </w:numPr>
+      </w:pPr>
+      <w:r>
+        <w:rPr>
+          <w:rFonts w:hint="eastAsia" w:ascii="Yu Gothic" w:hAnsi="Yu Gothic" w:eastAsia="Yu Gothic"/>
+        </w:rPr>
+        <w:t xml:space="preserve">macOS配布ZIP:</w:t>
       </w:r>
       <w:r>
         <w:rPr>
@@ -2292,7 +2503,108 @@
         <w:pStyle w:val="Compact"/>
         <w:numPr>
           <w:ilvl w:val="0"/>
-          <w:numId w:val="1011"/>
+          <w:numId w:val="1012"/>
+        </w:numPr>
+      </w:pPr>
+      <w:r>
+        <w:rPr>
+          <w:rFonts w:ascii="Yu Gothic" w:hAnsi="Yu Gothic" w:eastAsia="Yu Gothic"/>
+        </w:rPr>
+        <w:t xml:space="preserve">WindowsはGitHub Actionsの</w:t>
+      </w:r>
+      <w:r>
+        <w:rPr>
+          <w:rStyle w:val="VerbatimChar"/>
+          <w:rFonts w:ascii="Yu Gothic" w:hAnsi="Yu Gothic" w:eastAsia="Yu Gothic"/>
+        </w:rPr>
+        <w:t xml:space="preserve">windows-latest</w:t>
+      </w:r>
+      <w:r>
+        <w:rPr>
+          <w:rFonts w:hint="eastAsia" w:ascii="Yu Gothic" w:hAnsi="Yu Gothic" w:eastAsia="Yu Gothic"/>
+        </w:rPr>
+        <w:t xml:space="preserve">環境でPyInstaller</w:t>
+      </w:r>
+      <w:r>
+        <w:rPr>
+          <w:rFonts w:ascii="Yu Gothic" w:hAnsi="Yu Gothic" w:eastAsia="Yu Gothic"/>
+        </w:rPr>
+        <w:t xml:space="preserve"> one-file / windowed EXEを</w:t>
+      </w:r>
+      <w:r>
+        <w:rPr>
+          <w:rFonts w:ascii="Yu Gothic" w:hAnsi="Yu Gothic" w:eastAsia="Yu Gothic"/>
+        </w:rPr>
+        <w:t xml:space="preserve"> </w:t>
+      </w:r>
+      <w:r>
+        <w:rPr>
+          <w:rFonts w:ascii="Yu Gothic" w:hAnsi="Yu Gothic" w:eastAsia="Yu Gothic"/>
+        </w:rPr>
+        <w:t xml:space="preserve">ビルドする。</w:t>
+      </w:r>
+    </w:p>
+    <w:p>
+      <w:pPr>
+        <w:pStyle w:val="Compact"/>
+        <w:numPr>
+          <w:ilvl w:val="0"/>
+          <w:numId w:val="1012"/>
+        </w:numPr>
+      </w:pPr>
+      <w:r>
+        <w:rPr>
+          <w:rFonts w:hint="eastAsia" w:ascii="Yu Gothic" w:hAnsi="Yu Gothic" w:eastAsia="Yu Gothic"/>
+        </w:rPr>
+        <w:t xml:space="preserve">Windows配布EXE:</w:t>
+      </w:r>
+      <w:r>
+        <w:rPr>
+          <w:rFonts w:ascii="Yu Gothic" w:hAnsi="Yu Gothic" w:eastAsia="Yu Gothic"/>
+        </w:rPr>
+        <w:t xml:space="preserve"> </w:t>
+      </w:r>
+      <w:r>
+        <w:rPr>
+          <w:rStyle w:val="VerbatimChar"/>
+          <w:rFonts w:ascii="Yu Gothic" w:hAnsi="Yu Gothic" w:eastAsia="Yu Gothic"/>
+        </w:rPr>
+        <w:t xml:space="preserve">Codex-App-Easy-Switcher-Windows.exe</w:t>
+      </w:r>
+    </w:p>
+    <w:p>
+      <w:pPr>
+        <w:pStyle w:val="Compact"/>
+        <w:numPr>
+          <w:ilvl w:val="0"/>
+          <w:numId w:val="1012"/>
+        </w:numPr>
+      </w:pPr>
+      <w:r>
+        <w:rPr>
+          <w:rFonts w:hint="eastAsia" w:ascii="Yu Gothic" w:hAnsi="Yu Gothic" w:eastAsia="Yu Gothic"/>
+        </w:rPr>
+        <w:t xml:space="preserve">バージョンタグのpush時にWindows</w:t>
+      </w:r>
+      <w:r>
+        <w:rPr>
+          <w:rFonts w:ascii="Yu Gothic" w:hAnsi="Yu Gothic" w:eastAsia="Yu Gothic"/>
+        </w:rPr>
+        <w:t xml:space="preserve"> EXEとSHA256ファイルをGitHub </w:t>
+      </w:r>
+      <w:r>
+        <w:rPr>
+          <w:rFonts w:hint="eastAsia" w:ascii="Yu Gothic" w:hAnsi="Yu Gothic" w:eastAsia="Yu Gothic"/>
+        </w:rPr>
+        <w:t xml:space="preserve">Releaseへ自動添付する。</w:t>
+      </w:r>
+    </w:p>
+    <w:p>
+      <w:pPr>
+        <w:pStyle w:val="Compact"/>
+        <w:numPr>
+          <w:ilvl w:val="0"/>
+          <w:numId w:val="1012"/>
         </w:numPr>
       </w:pPr>
       <w:r>
@@ -2307,7 +2619,7 @@
         <w:pStyle w:val="Compact"/>
         <w:numPr>
           <w:ilvl w:val="0"/>
-          <w:numId w:val="1011"/>
+          <w:numId w:val="1012"/>
         </w:numPr>
       </w:pPr>
       <w:r>
@@ -2317,8 +2629,29 @@
         <w:t xml:space="preserve">アドホック署名を行い、Apple公証は実施しない。</w:t>
       </w:r>
     </w:p>
-    <w:bookmarkEnd w:id="25"/>
-    <w:bookmarkStart w:id="26" w:name="Xc9856cca48812e8dfa058cc41ce43e049f1c578"/>
+    <w:p>
+      <w:pPr>
+        <w:pStyle w:val="Compact"/>
+        <w:numPr>
+          <w:ilvl w:val="0"/>
+          <w:numId w:val="1012"/>
+        </w:numPr>
+      </w:pPr>
+      <w:r>
+        <w:rPr>
+          <w:rFonts w:ascii="Yu Gothic" w:hAnsi="Yu Gothic" w:eastAsia="Yu Gothic"/>
+        </w:rPr>
+        <w:t xml:space="preserve">Windows </w:t>
+      </w:r>
+      <w:r>
+        <w:rPr>
+          <w:rFonts w:hint="eastAsia" w:ascii="Yu Gothic" w:hAnsi="Yu Gothic" w:eastAsia="Yu Gothic"/>
+        </w:rPr>
+        <w:t xml:space="preserve">EXEはコード署名証明書による署名を実施しない。</w:t>
+      </w:r>
+    </w:p>
+    <w:bookmarkEnd w:id="26"/>
+    <w:bookmarkStart w:id="27" w:name="Xc9856cca48812e8dfa058cc41ce43e049f1c578"/>
     <w:p>
       <w:pPr>
         <w:pStyle w:val="Heading2"/>
@@ -2341,7 +2674,7 @@
         <w:pStyle w:val="Compact"/>
         <w:numPr>
           <w:ilvl w:val="0"/>
-          <w:numId w:val="1012"/>
+          <w:numId w:val="1013"/>
         </w:numPr>
       </w:pPr>
       <w:r>
@@ -2356,7 +2689,7 @@
         <w:pStyle w:val="Compact"/>
         <w:numPr>
           <w:ilvl w:val="0"/>
-          <w:numId w:val="1012"/>
+          <w:numId w:val="1013"/>
         </w:numPr>
       </w:pPr>
       <w:r>
@@ -2371,7 +2704,7 @@
         <w:pStyle w:val="Compact"/>
         <w:numPr>
           <w:ilvl w:val="0"/>
-          <w:numId w:val="1012"/>
+          <w:numId w:val="1013"/>
         </w:numPr>
       </w:pPr>
       <w:r>
@@ -2386,7 +2719,7 @@
         <w:pStyle w:val="Compact"/>
         <w:numPr>
           <w:ilvl w:val="0"/>
-          <w:numId w:val="1012"/>
+          <w:numId w:val="1013"/>
         </w:numPr>
       </w:pPr>
       <w:r>
@@ -2413,7 +2746,7 @@
         <w:pStyle w:val="Compact"/>
         <w:numPr>
           <w:ilvl w:val="0"/>
-          <w:numId w:val="1012"/>
+          <w:numId w:val="1013"/>
         </w:numPr>
       </w:pPr>
       <w:r>
@@ -2441,7 +2774,7 @@
         <w:pStyle w:val="Compact"/>
         <w:numPr>
           <w:ilvl w:val="0"/>
-          <w:numId w:val="1012"/>
+          <w:numId w:val="1013"/>
         </w:numPr>
       </w:pPr>
       <w:r>
@@ -2451,8 +2784,62 @@
         <w:t xml:space="preserve">Apple公証がないため、初回起動時にmacOSの警告が表示される場合がある。</w:t>
       </w:r>
     </w:p>
-    <w:bookmarkEnd w:id="26"/>
-    <w:bookmarkStart w:id="27" w:name="X1f38857ac360a8d826ab1002030bf11b8b088db"/>
+    <w:p>
+      <w:pPr>
+        <w:pStyle w:val="Compact"/>
+        <w:numPr>
+          <w:ilvl w:val="0"/>
+          <w:numId w:val="1013"/>
+        </w:numPr>
+      </w:pPr>
+      <w:r>
+        <w:rPr>
+          <w:rFonts w:hint="eastAsia" w:ascii="Yu Gothic" w:hAnsi="Yu Gothic" w:eastAsia="Yu Gothic"/>
+        </w:rPr>
+        <w:t xml:space="preserve">Windowsコード署名がないため、SmartScreen警告が表示される場合がある。</w:t>
+      </w:r>
+    </w:p>
+    <w:p>
+      <w:pPr>
+        <w:pStyle w:val="Compact"/>
+        <w:numPr>
+          <w:ilvl w:val="0"/>
+          <w:numId w:val="1013"/>
+        </w:numPr>
+      </w:pPr>
+      <w:r>
+        <w:rPr>
+          <w:rFonts w:hint="eastAsia" w:ascii="Yu Gothic" w:hAnsi="Yu Gothic" w:eastAsia="Yu Gothic"/>
+        </w:rPr>
+        <w:t xml:space="preserve">Windows版はGitHub</w:t>
+      </w:r>
+      <w:r>
+        <w:rPr>
+          <w:rFonts w:ascii="Yu Gothic" w:hAnsi="Yu Gothic" w:eastAsia="Yu Gothic"/>
+        </w:rPr>
+        <w:t xml:space="preserve"> </w:t>
+      </w:r>
+      <w:r>
+        <w:rPr>
+          <w:rFonts w:hint="eastAsia" w:ascii="Yu Gothic" w:hAnsi="Yu Gothic" w:eastAsia="Yu Gothic"/>
+        </w:rPr>
+        <w:t xml:space="preserve">Actions上のビルド・自動テスト済みだが、Windows実機の操作確認は</w:t>
+      </w:r>
+      <w:r>
+        <w:rPr>
+          <w:rFonts w:ascii="Yu Gothic" w:hAnsi="Yu Gothic" w:eastAsia="Yu Gothic"/>
+        </w:rPr>
+        <w:t xml:space="preserve"> </w:t>
+      </w:r>
+      <w:r>
+        <w:rPr>
+          <w:rFonts w:hint="eastAsia" w:ascii="Yu Gothic" w:hAnsi="Yu Gothic" w:eastAsia="Yu Gothic"/>
+        </w:rPr>
+        <w:t xml:space="preserve">利用者による検証を待つ。</w:t>
+      </w:r>
+    </w:p>
+    <w:bookmarkEnd w:id="27"/>
+    <w:bookmarkStart w:id="28" w:name="X1f38857ac360a8d826ab1002030bf11b8b088db"/>
     <w:p>
       <w:pPr>
         <w:pStyle w:val="Heading2"/>
@@ -2475,7 +2862,7 @@
         <w:pStyle w:val="Compact"/>
         <w:numPr>
           <w:ilvl w:val="0"/>
-          <w:numId w:val="1013"/>
+          <w:numId w:val="1014"/>
         </w:numPr>
       </w:pPr>
       <w:r>
@@ -2503,7 +2890,7 @@
         <w:pStyle w:val="Compact"/>
         <w:numPr>
           <w:ilvl w:val="0"/>
-          <w:numId w:val="1013"/>
+          <w:numId w:val="1014"/>
         </w:numPr>
       </w:pPr>
       <w:r>
@@ -2518,7 +2905,7 @@
         <w:pStyle w:val="Compact"/>
         <w:numPr>
           <w:ilvl w:val="0"/>
-          <w:numId w:val="1013"/>
+          <w:numId w:val="1014"/>
         </w:numPr>
       </w:pPr>
       <w:r>
@@ -2533,7 +2920,7 @@
         <w:pStyle w:val="Compact"/>
         <w:numPr>
           <w:ilvl w:val="0"/>
-          <w:numId w:val="1013"/>
+          <w:numId w:val="1014"/>
         </w:numPr>
       </w:pPr>
       <w:r>
@@ -2560,7 +2947,7 @@
         <w:pStyle w:val="Compact"/>
         <w:numPr>
           <w:ilvl w:val="0"/>
-          <w:numId w:val="1013"/>
+          <w:numId w:val="1014"/>
         </w:numPr>
       </w:pPr>
       <w:r>
@@ -2575,7 +2962,7 @@
         <w:pStyle w:val="Compact"/>
         <w:numPr>
           <w:ilvl w:val="0"/>
-          <w:numId w:val="1013"/>
+          <w:numId w:val="1014"/>
         </w:numPr>
       </w:pPr>
       <w:r>
@@ -2590,7 +2977,7 @@
         <w:pStyle w:val="Compact"/>
         <w:numPr>
           <w:ilvl w:val="0"/>
-          <w:numId w:val="1013"/>
+          <w:numId w:val="1014"/>
         </w:numPr>
       </w:pPr>
       <w:r>
@@ -2605,7 +2992,7 @@
         <w:pStyle w:val="Compact"/>
         <w:numPr>
           <w:ilvl w:val="0"/>
-          <w:numId w:val="1013"/>
+          <w:numId w:val="1014"/>
         </w:numPr>
       </w:pPr>
       <w:r>
@@ -2620,18 +3007,45 @@
         <w:pStyle w:val="Compact"/>
         <w:numPr>
           <w:ilvl w:val="0"/>
-          <w:numId w:val="1013"/>
-        </w:numPr>
-      </w:pPr>
-      <w:r>
-        <w:rPr>
-          <w:rFonts w:hint="eastAsia" w:ascii="Yu Gothic" w:hAnsi="Yu Gothic" w:eastAsia="Yu Gothic"/>
-        </w:rPr>
-        <w:t xml:space="preserve">自動テストがすべて成功する。</w:t>
-      </w:r>
-    </w:p>
-    <w:bookmarkEnd w:id="27"/>
+          <w:numId w:val="1014"/>
+        </w:numPr>
+      </w:pPr>
+      <w:r>
+        <w:rPr>
+          <w:rFonts w:ascii="Yu Gothic" w:hAnsi="Yu Gothic" w:eastAsia="Yu Gothic"/>
+        </w:rPr>
+        <w:t xml:space="preserve">macOS / WindowsのGitHub </w:t>
+      </w:r>
+      <w:r>
+        <w:rPr>
+          <w:rFonts w:hint="eastAsia" w:ascii="Yu Gothic" w:hAnsi="Yu Gothic" w:eastAsia="Yu Gothic"/>
+        </w:rPr>
+        <w:t xml:space="preserve">Actions自動テストがすべて成功する。</w:t>
+      </w:r>
+    </w:p>
+    <w:p>
+      <w:pPr>
+        <w:pStyle w:val="Compact"/>
+        <w:numPr>
+          <w:ilvl w:val="0"/>
+          <w:numId w:val="1014"/>
+        </w:numPr>
+      </w:pPr>
+      <w:r>
+        <w:rPr>
+          <w:rFonts w:ascii="Yu Gothic" w:hAnsi="Yu Gothic" w:eastAsia="Yu Gothic"/>
+        </w:rPr>
+        <w:t xml:space="preserve">GitHub </w:t>
+      </w:r>
+      <w:r>
+        <w:rPr>
+          <w:rFonts w:hint="eastAsia" w:ascii="Yu Gothic" w:hAnsi="Yu Gothic" w:eastAsia="Yu Gothic"/>
+        </w:rPr>
+        <w:t xml:space="preserve">ReleaseからMac版ZIPとWindows版EXEを直接ダウンロードできる。</w:t>
+      </w:r>
+    </w:p>
     <w:bookmarkEnd w:id="28"/>
+    <w:bookmarkEnd w:id="29"/>
     <w:sectPr>
       <w:footerReference w:type="default" r:id="rId10"/>
       <w:footnotePr>
@@ -3046,6 +3460,9 @@
     <w:abstractNumId w:val="991"/>
   </w:num>
   <w:num w:numId="1013">
+    <w:abstractNumId w:val="991"/>
+  </w:num>
+  <w:num w:numId="1014">
     <w:abstractNumId w:val="991"/>
   </w:num>
 </w:numbering>

</xml_diff>